<commit_message>
Secure rider self-profile creation
</commit_message>
<xml_diff>
--- a/docs/RIDER_BOOKING_API_AND_DATABASE_REFERENCE_UPDATED.docx
+++ b/docs/RIDER_BOOKING_API_AND_DATABASE_REFERENCE_UPDATED.docx
@@ -215,6 +215,60 @@
                 <w:sz w:val="17"/>
               </w:rPr>
               <w:t>Only VERIFIED, AVAILABLE riders with a location newer than 10 minutes and within 10 km are eligible.</w:t>
+            </w:r>
+          </w:p>
+        </w:tc>
+      </w:tr>
+      <w:tr>
+        <w:tc>
+          <w:tcPr>
+            <w:tcW w:type="dxa" w:w="2448"/>
+            <w:vAlign w:val="center"/>
+            <w:tcMar>
+              <w:top w:w="72" w:type="dxa"/>
+              <w:start w:w="120" w:type="dxa"/>
+              <w:bottom w:w="72" w:type="dxa"/>
+              <w:end w:w="120" w:type="dxa"/>
+            </w:tcMar>
+          </w:tcPr>
+          <w:p>
+            <w:pPr>
+              <w:spacing w:after="0" w:line="259" w:lineRule="auto"/>
+            </w:pPr>
+            <w:r/>
+            <w:r>
+              <w:rPr>
+                <w:rFonts w:ascii="Calibri" w:hAnsi="Calibri"/>
+                <w:b w:val="0"/>
+                <w:sz w:val="17"/>
+              </w:rPr>
+              <w:t>Dispatch availability</w:t>
+            </w:r>
+          </w:p>
+        </w:tc>
+        <w:tc>
+          <w:tcPr>
+            <w:tcW w:type="dxa" w:w="6768"/>
+            <w:vAlign w:val="center"/>
+            <w:tcMar>
+              <w:top w:w="72" w:type="dxa"/>
+              <w:start w:w="120" w:type="dxa"/>
+              <w:bottom w:w="72" w:type="dxa"/>
+              <w:end w:w="120" w:type="dxa"/>
+            </w:tcMar>
+          </w:tcPr>
+          <w:p>
+            <w:pPr>
+              <w:spacing w:after="0" w:line="259" w:lineRule="auto"/>
+            </w:pPr>
+            <w:r/>
+            <w:r>
+              <w:rPr>
+                <w:rFonts w:ascii="Calibri" w:hAnsi="Calibri"/>
+                <w:b w:val="0"/>
+                <w:sz w:val="17"/>
+              </w:rPr>
+              <w:t>A rider can change only their own status between AVAILABLE and OFFLINE. An accepted rider is set to ON_TRIP and cannot toggle status until the ride ends or is cancelled.</w:t>
             </w:r>
           </w:p>
         </w:tc>
@@ -4556,7 +4610,7 @@
                 <w:b w:val="0"/>
                 <w:sz w:val="15"/>
               </w:rPr>
-              <w:t>ADMIN</w:t>
+              <w:t>RIDER</w:t>
             </w:r>
           </w:p>
         </w:tc>
@@ -4582,7 +4636,7 @@
                 <w:b w:val="0"/>
                 <w:sz w:val="15"/>
               </w:rPr>
-              <w:t>Rider profile JSON</w:t>
+              <w:t>Rider profile JSON; ownership from JWT</w:t>
             </w:r>
           </w:p>
         </w:tc>
@@ -5113,6 +5167,112 @@
                 <w:sz w:val="15"/>
               </w:rPr>
               <w:t>latitude/longitude JSON</w:t>
+            </w:r>
+          </w:p>
+        </w:tc>
+      </w:tr>
+      <w:tr>
+        <w:tc>
+          <w:tcPr>
+            <w:tcW w:type="dxa" w:w="893"/>
+            <w:vAlign w:val="center"/>
+            <w:tcMar>
+              <w:top w:w="72" w:type="dxa"/>
+              <w:start w:w="120" w:type="dxa"/>
+              <w:bottom w:w="72" w:type="dxa"/>
+              <w:end w:w="120" w:type="dxa"/>
+            </w:tcMar>
+          </w:tcPr>
+          <w:p>
+            <w:pPr>
+              <w:spacing w:after="0" w:line="259" w:lineRule="auto"/>
+            </w:pPr>
+            <w:r/>
+            <w:r>
+              <w:rPr>
+                <w:rFonts w:ascii="Calibri" w:hAnsi="Calibri"/>
+                <w:b w:val="0"/>
+                <w:sz w:val="15"/>
+              </w:rPr>
+              <w:t>PATCH</w:t>
+            </w:r>
+          </w:p>
+        </w:tc>
+        <w:tc>
+          <w:tcPr>
+            <w:tcW w:type="dxa" w:w="3629"/>
+            <w:vAlign w:val="center"/>
+            <w:tcMar>
+              <w:top w:w="72" w:type="dxa"/>
+              <w:start w:w="120" w:type="dxa"/>
+              <w:bottom w:w="72" w:type="dxa"/>
+              <w:end w:w="120" w:type="dxa"/>
+            </w:tcMar>
+          </w:tcPr>
+          <w:p>
+            <w:pPr>
+              <w:spacing w:after="0" w:line="259" w:lineRule="auto"/>
+            </w:pPr>
+            <w:r/>
+            <w:r>
+              <w:rPr>
+                <w:rFonts w:ascii="Calibri" w:hAnsi="Calibri"/>
+                <w:b w:val="0"/>
+                <w:sz w:val="15"/>
+              </w:rPr>
+              <w:t>/rider/status?status=</w:t>
+            </w:r>
+          </w:p>
+        </w:tc>
+        <w:tc>
+          <w:tcPr>
+            <w:tcW w:type="dxa" w:w="1555"/>
+            <w:vAlign w:val="center"/>
+            <w:tcMar>
+              <w:top w:w="72" w:type="dxa"/>
+              <w:start w:w="120" w:type="dxa"/>
+              <w:bottom w:w="72" w:type="dxa"/>
+              <w:end w:w="120" w:type="dxa"/>
+            </w:tcMar>
+          </w:tcPr>
+          <w:p>
+            <w:pPr>
+              <w:spacing w:after="0" w:line="259" w:lineRule="auto"/>
+            </w:pPr>
+            <w:r/>
+            <w:r>
+              <w:rPr>
+                <w:rFonts w:ascii="Calibri" w:hAnsi="Calibri"/>
+                <w:b w:val="0"/>
+                <w:sz w:val="15"/>
+              </w:rPr>
+              <w:t>RIDER</w:t>
+            </w:r>
+          </w:p>
+        </w:tc>
+        <w:tc>
+          <w:tcPr>
+            <w:tcW w:type="dxa" w:w="2981"/>
+            <w:vAlign w:val="center"/>
+            <w:tcMar>
+              <w:top w:w="72" w:type="dxa"/>
+              <w:start w:w="120" w:type="dxa"/>
+              <w:bottom w:w="72" w:type="dxa"/>
+              <w:end w:w="120" w:type="dxa"/>
+            </w:tcMar>
+          </w:tcPr>
+          <w:p>
+            <w:pPr>
+              <w:spacing w:after="0" w:line="259" w:lineRule="auto"/>
+            </w:pPr>
+            <w:r/>
+            <w:r>
+              <w:rPr>
+                <w:rFonts w:ascii="Calibri" w:hAnsi="Calibri"/>
+                <w:b w:val="0"/>
+                <w:sz w:val="15"/>
+              </w:rPr>
+              <w:t>AVAILABLE or OFFLINE query</w:t>
             </w:r>
           </w:p>
         </w:tc>
@@ -6587,7 +6747,7 @@
                 <w:b w:val="0"/>
                 <w:sz w:val="16"/>
               </w:rPr>
-              <w:t>Admin</w:t>
+              <w:t>Rider</w:t>
             </w:r>
           </w:p>
         </w:tc>
@@ -6639,7 +6799,7 @@
                 <w:b w:val="0"/>
                 <w:sz w:val="16"/>
               </w:rPr>
-              <w:t>Create rider profile linked with userId = rider USERS.ID.</w:t>
+              <w:t>Create the rider's own profile; the server links it to the authenticated RIDER account.</w:t>
             </w:r>
           </w:p>
         </w:tc>
@@ -7169,7 +7329,7 @@
                 <w:b w:val="0"/>
                 <w:sz w:val="16"/>
               </w:rPr>
-              <w:t>Ride becomes ACCEPTED; capture rideId and OTP.</w:t>
+              <w:t>Only the authenticated, AVAILABLE rider who received the SENT request can accept; ride becomes ACCEPTED and rider becomes ON_TRIP.</w:t>
             </w:r>
           </w:p>
         </w:tc>
@@ -7381,7 +7541,7 @@
                 <w:b w:val="0"/>
                 <w:sz w:val="16"/>
               </w:rPr>
-              <w:t>Ride becomes STARTED and rider becomes ON_TRIP.</w:t>
+              <w:t>Ride becomes STARTED.</w:t>
             </w:r>
           </w:p>
         </w:tc>
@@ -11818,7 +11978,7 @@
           <w:b w:val="0"/>
           <w:sz w:val="18"/>
         </w:rPr>
-        <w:t>Bearer {{adminJwt}} — ADMIN role</w:t>
+        <w:t>Bearer {{riderJwt}} — RIDER role</w:t>
       </w:r>
       <w:r>
         <w:rPr>
@@ -11883,7 +12043,7 @@
           <w:color w:val="1F4D78"/>
           <w:sz w:val="16"/>
         </w:rPr>
-        <w:t>Authorization: Bearer {{adminJwt}}</w:t>
+        <w:t>Authorization: Bearer {{riderJwt}}</w:t>
       </w:r>
     </w:p>
     <w:p>
@@ -11951,7 +12111,7 @@
           <w:color w:val="1F4D78"/>
           <w:sz w:val="16"/>
         </w:rPr>
-        <w:t xml:space="preserve">  "userId": {{riderUserId}},</w:t>
+        <w:t xml:space="preserve">  "name": "Vijay Rider",</w:t>
       </w:r>
     </w:p>
     <w:p>
@@ -11968,7 +12128,7 @@
           <w:color w:val="1F4D78"/>
           <w:sz w:val="16"/>
         </w:rPr>
-        <w:t xml:space="preserve">  "name": "Vijay Rider",</w:t>
+        <w:t xml:space="preserve">  "mobileNumber": "9167300000",</w:t>
       </w:r>
     </w:p>
     <w:p>
@@ -11985,7 +12145,235 @@
           <w:color w:val="1F4D78"/>
           <w:sz w:val="16"/>
         </w:rPr>
-        <w:t xml:space="preserve">  "mobileNumber": "9167300000",</w:t>
+        <w:t xml:space="preserve">  "status": "AVAILABLE"</w:t>
+      </w:r>
+    </w:p>
+    <w:p>
+      <w:pPr>
+        <w:keepLines/>
+        <w:spacing w:after="60" w:line="240" w:lineRule="auto"/>
+        <w:ind w:left="230" w:right="115"/>
+        <w:shd w:fill="F5F8FC"/>
+      </w:pPr>
+      <w:r>
+        <w:rPr>
+          <w:rFonts w:ascii="Consolas" w:hAnsi="Consolas"/>
+          <w:b w:val="0"/>
+          <w:color w:val="1F4D78"/>
+          <w:sz w:val="16"/>
+        </w:rPr>
+        <w:t>}</w:t>
+      </w:r>
+    </w:p>
+    <w:p>
+      <w:pPr>
+        <w:spacing w:before="0" w:after="0" w:line="283" w:lineRule="auto"/>
+      </w:pPr>
+      <w:r>
+        <w:rPr>
+          <w:rFonts w:ascii="Calibri" w:hAnsi="Calibri"/>
+          <w:b/>
+          <w:color w:val="1F4D78"/>
+          <w:sz w:val="18"/>
+        </w:rPr>
+        <w:t xml:space="preserve">Expected result: </w:t>
+      </w:r>
+      <w:r>
+        <w:rPr>
+          <w:rFonts w:ascii="Calibri" w:hAnsi="Calibri"/>
+          <w:b w:val="0"/>
+          <w:sz w:val="18"/>
+        </w:rPr>
+        <w:t>201 Created</w:t>
+      </w:r>
+    </w:p>
+    <w:p>
+      <w:pPr>
+        <w:keepLines/>
+        <w:spacing w:before="0" w:after="0" w:line="283" w:lineRule="auto"/>
+      </w:pPr>
+      <w:r>
+        <w:rPr>
+          <w:rFonts w:ascii="Calibri" w:hAnsi="Calibri"/>
+          <w:b w:val="0"/>
+          <w:sz w:val="18"/>
+        </w:rPr>
+        <w:t>{</w:t>
+      </w:r>
+    </w:p>
+    <w:p>
+      <w:pPr>
+        <w:keepLines/>
+        <w:spacing w:before="0" w:after="0" w:line="283" w:lineRule="auto"/>
+      </w:pPr>
+      <w:r>
+        <w:rPr>
+          <w:rFonts w:ascii="Calibri" w:hAnsi="Calibri"/>
+          <w:b w:val="0"/>
+          <w:sz w:val="18"/>
+        </w:rPr>
+        <w:t xml:space="preserve">  "id": 3,</w:t>
+      </w:r>
+    </w:p>
+    <w:p>
+      <w:pPr>
+        <w:keepLines/>
+        <w:spacing w:before="0" w:after="0" w:line="283" w:lineRule="auto"/>
+      </w:pPr>
+      <w:r>
+        <w:rPr>
+          <w:rFonts w:ascii="Calibri" w:hAnsi="Calibri"/>
+          <w:b w:val="0"/>
+          <w:sz w:val="18"/>
+        </w:rPr>
+        <w:t xml:space="preserve">  "name":"Vijay Rider",</w:t>
+      </w:r>
+    </w:p>
+    <w:p>
+      <w:pPr>
+        <w:keepLines/>
+        <w:spacing w:before="0" w:after="0" w:line="283" w:lineRule="auto"/>
+      </w:pPr>
+      <w:r>
+        <w:rPr>
+          <w:rFonts w:ascii="Calibri" w:hAnsi="Calibri"/>
+          <w:b w:val="0"/>
+          <w:sz w:val="18"/>
+        </w:rPr>
+        <w:t xml:space="preserve">  "mobile_number":"9167300000",</w:t>
+      </w:r>
+    </w:p>
+    <w:p>
+      <w:pPr>
+        <w:keepLines/>
+        <w:spacing w:before="0" w:after="0" w:line="283" w:lineRule="auto"/>
+      </w:pPr>
+      <w:r>
+        <w:rPr>
+          <w:rFonts w:ascii="Calibri" w:hAnsi="Calibri"/>
+          <w:b w:val="0"/>
+          <w:sz w:val="18"/>
+        </w:rPr>
+        <w:t xml:space="preserve">  "status":"AVAILABLE",</w:t>
+      </w:r>
+    </w:p>
+    <w:p>
+      <w:pPr>
+        <w:keepLines/>
+        <w:spacing w:before="0" w:after="0" w:line="283" w:lineRule="auto"/>
+      </w:pPr>
+      <w:r>
+        <w:rPr>
+          <w:rFonts w:ascii="Calibri" w:hAnsi="Calibri"/>
+          <w:b w:val="0"/>
+          <w:sz w:val="18"/>
+        </w:rPr>
+        <w:t xml:space="preserve">  "userId":3</w:t>
+      </w:r>
+    </w:p>
+    <w:p>
+      <w:pPr>
+        <w:keepLines/>
+        <w:spacing w:before="0" w:after="100" w:line="283" w:lineRule="auto"/>
+      </w:pPr>
+      <w:r>
+        <w:rPr>
+          <w:rFonts w:ascii="Calibri" w:hAnsi="Calibri"/>
+          <w:b w:val="0"/>
+          <w:sz w:val="18"/>
+        </w:rPr>
+        <w:t>}</w:t>
+      </w:r>
+    </w:p>
+    <w:p>
+      <w:pPr>
+        <w:spacing w:before="0" w:after="120" w:line="283" w:lineRule="auto"/>
+      </w:pPr>
+      <w:r>
+        <w:rPr>
+          <w:rFonts w:ascii="Calibri" w:hAnsi="Calibri"/>
+          <w:b/>
+          <w:color w:val="9C6500"/>
+          <w:sz w:val="18"/>
+        </w:rPr>
+        <w:t xml:space="preserve">Note: </w:t>
+      </w:r>
+      <w:r>
+        <w:rPr>
+          <w:rFonts w:ascii="Calibri" w:hAnsi="Calibri"/>
+          <w:b w:val="0"/>
+          <w:color w:val="9C6500"/>
+          <w:sz w:val="18"/>
+        </w:rPr>
+        <w:t>The request must not contain userId. The server takes the username from the rider JWT, finds that RIDER account, and stores its USERS.ID as USER_ID. Copy id to {{riderId}}. USER_ID is unique, so one login account cannot own two rider profiles; a duplicate profile request is rejected. A rider can submit only AVAILABLE or OFFLINE—ON_TRIP is controlled by the ride lifecycle.</w:t>
+      </w:r>
+    </w:p>
+    <w:p>
+      <w:pPr>
+        <w:keepNext/>
+        <w:spacing w:before="160" w:after="100"/>
+      </w:pPr>
+      <w:r>
+        <w:rPr>
+          <w:rFonts w:ascii="Calibri" w:hAnsi="Calibri"/>
+          <w:b/>
+          <w:color w:val="1F4D78"/>
+          <w:sz w:val="23"/>
+        </w:rPr>
+        <w:t>POST /rider/{riderId}/verification-details</w:t>
+      </w:r>
+    </w:p>
+    <w:p>
+      <w:pPr>
+        <w:spacing w:before="0" w:after="60" w:line="283" w:lineRule="auto"/>
+      </w:pPr>
+      <w:r>
+        <w:rPr>
+          <w:rFonts w:ascii="Calibri" w:hAnsi="Calibri"/>
+          <w:b/>
+          <w:color w:val="1F4D78"/>
+          <w:sz w:val="18"/>
+        </w:rPr>
+        <w:t xml:space="preserve">Authentication: </w:t>
+      </w:r>
+      <w:r>
+        <w:rPr>
+          <w:rFonts w:ascii="Calibri" w:hAnsi="Calibri"/>
+          <w:b w:val="0"/>
+          <w:sz w:val="18"/>
+        </w:rPr>
+        <w:t>Bearer JWT</w:t>
+      </w:r>
+      <w:r>
+        <w:rPr>
+          <w:rFonts w:ascii="Calibri" w:hAnsi="Calibri"/>
+          <w:b/>
+          <w:color w:val="1F4D78"/>
+          <w:sz w:val="18"/>
+        </w:rPr>
+        <w:t xml:space="preserve">   |   Request type: </w:t>
+      </w:r>
+      <w:r>
+        <w:rPr>
+          <w:rFonts w:ascii="Calibri" w:hAnsi="Calibri"/>
+          <w:b w:val="0"/>
+          <w:sz w:val="18"/>
+        </w:rPr>
+        <w:t>raw JSON</w:t>
+      </w:r>
+    </w:p>
+    <w:p>
+      <w:pPr>
+        <w:spacing w:before="0" w:after="40" w:line="283" w:lineRule="auto"/>
+      </w:pPr>
+      <w:r>
+        <w:rPr>
+          <w:rFonts w:ascii="Calibri" w:hAnsi="Calibri"/>
+          <w:b/>
+          <w:color w:val="1F4D78"/>
+          <w:sz w:val="18"/>
+        </w:rPr>
+        <w:t>Postman test</w:t>
       </w:r>
     </w:p>
     <w:p>
@@ -12002,7 +12390,177 @@
           <w:color w:val="1F4D78"/>
           <w:sz w:val="16"/>
         </w:rPr>
-        <w:t xml:space="preserve">  "status": "AVAILABLE"</w:t>
+        <w:t>POST {{baseUrl}}/rider/{{riderId}}/verification-details</w:t>
+      </w:r>
+    </w:p>
+    <w:p>
+      <w:pPr>
+        <w:keepLines/>
+        <w:spacing w:after="0" w:line="240" w:lineRule="auto"/>
+        <w:ind w:left="230" w:right="115"/>
+        <w:shd w:fill="F5F8FC"/>
+      </w:pPr>
+      <w:r>
+        <w:rPr>
+          <w:rFonts w:ascii="Consolas" w:hAnsi="Consolas"/>
+          <w:b w:val="0"/>
+          <w:color w:val="1F4D78"/>
+          <w:sz w:val="16"/>
+        </w:rPr>
+        <w:t>Authorization: Bearer {{adminJwt}}</w:t>
+      </w:r>
+    </w:p>
+    <w:p>
+      <w:pPr>
+        <w:keepLines/>
+        <w:spacing w:after="0" w:line="240" w:lineRule="auto"/>
+        <w:ind w:left="230" w:right="115"/>
+        <w:shd w:fill="F5F8FC"/>
+      </w:pPr>
+      <w:r>
+        <w:rPr>
+          <w:rFonts w:ascii="Consolas" w:hAnsi="Consolas"/>
+          <w:b w:val="0"/>
+          <w:color w:val="1F4D78"/>
+          <w:sz w:val="16"/>
+        </w:rPr>
+        <w:t>Content-Type: application/json</w:t>
+      </w:r>
+    </w:p>
+    <w:p>
+      <w:pPr>
+        <w:keepLines/>
+        <w:spacing w:after="0" w:line="240" w:lineRule="auto"/>
+        <w:ind w:left="230" w:right="115"/>
+        <w:shd w:fill="F5F8FC"/>
+      </w:pPr>
+      <w:r>
+        <w:rPr>
+          <w:rFonts w:ascii="Consolas" w:hAnsi="Consolas"/>
+          <w:b w:val="0"/>
+          <w:color w:val="1F4D78"/>
+          <w:sz w:val="16"/>
+        </w:rPr>
+        <w:t xml:space="preserve"> </w:t>
+      </w:r>
+    </w:p>
+    <w:p>
+      <w:pPr>
+        <w:keepLines/>
+        <w:spacing w:after="0" w:line="240" w:lineRule="auto"/>
+        <w:ind w:left="230" w:right="115"/>
+        <w:shd w:fill="F5F8FC"/>
+      </w:pPr>
+      <w:r>
+        <w:rPr>
+          <w:rFonts w:ascii="Consolas" w:hAnsi="Consolas"/>
+          <w:b w:val="0"/>
+          <w:color w:val="1F4D78"/>
+          <w:sz w:val="16"/>
+        </w:rPr>
+        <w:t>{</w:t>
+      </w:r>
+    </w:p>
+    <w:p>
+      <w:pPr>
+        <w:keepLines/>
+        <w:spacing w:after="0" w:line="240" w:lineRule="auto"/>
+        <w:ind w:left="230" w:right="115"/>
+        <w:shd w:fill="F5F8FC"/>
+      </w:pPr>
+      <w:r>
+        <w:rPr>
+          <w:rFonts w:ascii="Consolas" w:hAnsi="Consolas"/>
+          <w:b w:val="0"/>
+          <w:color w:val="1F4D78"/>
+          <w:sz w:val="16"/>
+        </w:rPr>
+        <w:t xml:space="preserve">  "aadhaarCardNumber": "123456789013",</w:t>
+      </w:r>
+    </w:p>
+    <w:p>
+      <w:pPr>
+        <w:keepLines/>
+        <w:spacing w:after="0" w:line="240" w:lineRule="auto"/>
+        <w:ind w:left="230" w:right="115"/>
+        <w:shd w:fill="F5F8FC"/>
+      </w:pPr>
+      <w:r>
+        <w:rPr>
+          <w:rFonts w:ascii="Consolas" w:hAnsi="Consolas"/>
+          <w:b w:val="0"/>
+          <w:color w:val="1F4D78"/>
+          <w:sz w:val="16"/>
+        </w:rPr>
+        <w:t xml:space="preserve">  "panCardNumber": "ABCDE1234F",</w:t>
+      </w:r>
+    </w:p>
+    <w:p>
+      <w:pPr>
+        <w:keepLines/>
+        <w:spacing w:after="0" w:line="240" w:lineRule="auto"/>
+        <w:ind w:left="230" w:right="115"/>
+        <w:shd w:fill="F5F8FC"/>
+      </w:pPr>
+      <w:r>
+        <w:rPr>
+          <w:rFonts w:ascii="Consolas" w:hAnsi="Consolas"/>
+          <w:b w:val="0"/>
+          <w:color w:val="1F4D78"/>
+          <w:sz w:val="16"/>
+        </w:rPr>
+        <w:t xml:space="preserve">  "drivingLicenseNumber": "MH0120230001234",</w:t>
+      </w:r>
+    </w:p>
+    <w:p>
+      <w:pPr>
+        <w:keepLines/>
+        <w:spacing w:after="0" w:line="240" w:lineRule="auto"/>
+        <w:ind w:left="230" w:right="115"/>
+        <w:shd w:fill="F5F8FC"/>
+      </w:pPr>
+      <w:r>
+        <w:rPr>
+          <w:rFonts w:ascii="Consolas" w:hAnsi="Consolas"/>
+          <w:b w:val="0"/>
+          <w:color w:val="1F4D78"/>
+          <w:sz w:val="16"/>
+        </w:rPr>
+        <w:t xml:space="preserve">  "bankAccountNumber": "123456789012",</w:t>
+      </w:r>
+    </w:p>
+    <w:p>
+      <w:pPr>
+        <w:keepLines/>
+        <w:spacing w:after="0" w:line="240" w:lineRule="auto"/>
+        <w:ind w:left="230" w:right="115"/>
+        <w:shd w:fill="F5F8FC"/>
+      </w:pPr>
+      <w:r>
+        <w:rPr>
+          <w:rFonts w:ascii="Consolas" w:hAnsi="Consolas"/>
+          <w:b w:val="0"/>
+          <w:color w:val="1F4D78"/>
+          <w:sz w:val="16"/>
+        </w:rPr>
+        <w:t xml:space="preserve">  "bankIfscCode": "HDFC0001234",</w:t>
+      </w:r>
+    </w:p>
+    <w:p>
+      <w:pPr>
+        <w:keepLines/>
+        <w:spacing w:after="0" w:line="240" w:lineRule="auto"/>
+        <w:ind w:left="230" w:right="115"/>
+        <w:shd w:fill="F5F8FC"/>
+      </w:pPr>
+      <w:r>
+        <w:rPr>
+          <w:rFonts w:ascii="Consolas" w:hAnsi="Consolas"/>
+          <w:b w:val="0"/>
+          <w:color w:val="1F4D78"/>
+          <w:sz w:val="16"/>
+        </w:rPr>
+        <w:t xml:space="preserve">  "bankAccountName": "Vijay Rider"</w:t>
       </w:r>
     </w:p>
     <w:p>
@@ -12069,7 +12627,7 @@
           <w:b w:val="0"/>
           <w:sz w:val="18"/>
         </w:rPr>
-        <w:t xml:space="preserve">  "id": 3,</w:t>
+        <w:t xml:space="preserve">  "riderId":3,</w:t>
       </w:r>
     </w:p>
     <w:p>
@@ -12083,7 +12641,7 @@
           <w:b w:val="0"/>
           <w:sz w:val="18"/>
         </w:rPr>
-        <w:t xml:space="preserve">  "name":"Vijay Rider",</w:t>
+        <w:t xml:space="preserve">  "aadhaarCardNumber":"123456789013",</w:t>
       </w:r>
     </w:p>
     <w:p>
@@ -12097,7 +12655,7 @@
           <w:b w:val="0"/>
           <w:sz w:val="18"/>
         </w:rPr>
-        <w:t xml:space="preserve">  "mobile_number":"9167300000",</w:t>
+        <w:t xml:space="preserve">  "panCardNumber":"ABCDE1234F",</w:t>
       </w:r>
     </w:p>
     <w:p>
@@ -12111,7 +12669,7 @@
           <w:b w:val="0"/>
           <w:sz w:val="18"/>
         </w:rPr>
-        <w:t xml:space="preserve">  "status":"AVAILABLE",</w:t>
+        <w:t xml:space="preserve">  "drivingLicenseNumber":"MH0120230001234",</w:t>
       </w:r>
     </w:p>
     <w:p>
@@ -12125,7 +12683,49 @@
           <w:b w:val="0"/>
           <w:sz w:val="18"/>
         </w:rPr>
-        <w:t xml:space="preserve">  "userId":3</w:t>
+        <w:t xml:space="preserve">  "bankAccountNumber":"123456789012",</w:t>
+      </w:r>
+    </w:p>
+    <w:p>
+      <w:pPr>
+        <w:keepLines/>
+        <w:spacing w:before="0" w:after="0" w:line="283" w:lineRule="auto"/>
+      </w:pPr>
+      <w:r>
+        <w:rPr>
+          <w:rFonts w:ascii="Calibri" w:hAnsi="Calibri"/>
+          <w:b w:val="0"/>
+          <w:sz w:val="18"/>
+        </w:rPr>
+        <w:t xml:space="preserve">  "bankIfscCode":"HDFC0001234",</w:t>
+      </w:r>
+    </w:p>
+    <w:p>
+      <w:pPr>
+        <w:keepLines/>
+        <w:spacing w:before="0" w:after="0" w:line="283" w:lineRule="auto"/>
+      </w:pPr>
+      <w:r>
+        <w:rPr>
+          <w:rFonts w:ascii="Calibri" w:hAnsi="Calibri"/>
+          <w:b w:val="0"/>
+          <w:sz w:val="18"/>
+        </w:rPr>
+        <w:t xml:space="preserve">  "bankAccountName":"Vijay Rider",</w:t>
+      </w:r>
+    </w:p>
+    <w:p>
+      <w:pPr>
+        <w:keepLines/>
+        <w:spacing w:before="0" w:after="0" w:line="283" w:lineRule="auto"/>
+      </w:pPr>
+      <w:r>
+        <w:rPr>
+          <w:rFonts w:ascii="Calibri" w:hAnsi="Calibri"/>
+          <w:b w:val="0"/>
+          <w:sz w:val="18"/>
+        </w:rPr>
+        <w:t xml:space="preserve">  "verified":false</w:t>
       </w:r>
     </w:p>
     <w:p>
@@ -12162,7 +12762,7 @@
           <w:color w:val="9C6500"/>
           <w:sz w:val="18"/>
         </w:rPr>
-        <w:t>userId is required, must exist in USERS, and its role must be RIDER. Copy id to {{riderId}}. USER_ID is unique, so one login account cannot own two rider profiles.</w:t>
+        <w:t>The rider ID comes only from the URL path. For rider 3, call /rider/3/verification-details. The body must not contain riderId. Saving again updates that same rider record and resets verified to false.</w:t>
       </w:r>
     </w:p>
     <w:p>
@@ -12177,7 +12777,7 @@
           <w:color w:val="1F4D78"/>
           <w:sz w:val="23"/>
         </w:rPr>
-        <w:t>POST /rider/{riderId}/verification-details</w:t>
+        <w:t>GET /rider/{riderId}/verification-details</w:t>
       </w:r>
     </w:p>
     <w:p>
@@ -12216,7 +12816,7 @@
           <w:b w:val="0"/>
           <w:sz w:val="18"/>
         </w:rPr>
-        <w:t>raw JSON</w:t>
+        <w:t>No body</w:t>
       </w:r>
     </w:p>
     <w:p>
@@ -12247,7 +12847,137 @@
           <w:color w:val="1F4D78"/>
           <w:sz w:val="16"/>
         </w:rPr>
-        <w:t>POST {{baseUrl}}/rider/{{riderId}}/verification-details</w:t>
+        <w:t>GET {{baseUrl}}/rider/{{riderId}}/verification-details</w:t>
+      </w:r>
+    </w:p>
+    <w:p>
+      <w:pPr>
+        <w:keepLines/>
+        <w:spacing w:after="60" w:line="240" w:lineRule="auto"/>
+        <w:ind w:left="230" w:right="115"/>
+        <w:shd w:fill="F5F8FC"/>
+      </w:pPr>
+      <w:r>
+        <w:rPr>
+          <w:rFonts w:ascii="Consolas" w:hAnsi="Consolas"/>
+          <w:b w:val="0"/>
+          <w:color w:val="1F4D78"/>
+          <w:sz w:val="16"/>
+        </w:rPr>
+        <w:t>Authorization: Bearer {{adminJwt}}</w:t>
+      </w:r>
+    </w:p>
+    <w:p>
+      <w:pPr>
+        <w:spacing w:before="0" w:after="100" w:line="283" w:lineRule="auto"/>
+      </w:pPr>
+      <w:r>
+        <w:rPr>
+          <w:rFonts w:ascii="Calibri" w:hAnsi="Calibri"/>
+          <w:b/>
+          <w:color w:val="1F4D78"/>
+          <w:sz w:val="18"/>
+        </w:rPr>
+        <w:t xml:space="preserve">Expected result: </w:t>
+      </w:r>
+      <w:r>
+        <w:rPr>
+          <w:rFonts w:ascii="Calibri" w:hAnsi="Calibri"/>
+          <w:b w:val="0"/>
+          <w:sz w:val="18"/>
+        </w:rPr>
+        <w:t>200 OK with the stored verification JSON.</w:t>
+      </w:r>
+    </w:p>
+    <w:p>
+      <w:pPr>
+        <w:spacing w:before="0" w:after="120" w:line="283" w:lineRule="auto"/>
+      </w:pPr>
+      <w:r>
+        <w:rPr>
+          <w:rFonts w:ascii="Calibri" w:hAnsi="Calibri"/>
+          <w:b/>
+          <w:color w:val="9C6500"/>
+          <w:sz w:val="18"/>
+        </w:rPr>
+        <w:t xml:space="preserve">Note: </w:t>
+      </w:r>
+      <w:r>
+        <w:rPr>
+          <w:rFonts w:ascii="Calibri" w:hAnsi="Calibri"/>
+          <w:b w:val="0"/>
+          <w:color w:val="9C6500"/>
+          <w:sz w:val="18"/>
+        </w:rPr>
+        <w:t>This currently exposes unmasked KYC/bank fields. Do not expose this endpoint to untrusted clients in production.</w:t>
+      </w:r>
+    </w:p>
+    <w:p>
+      <w:pPr>
+        <w:keepNext/>
+        <w:spacing w:before="160" w:after="100"/>
+      </w:pPr>
+      <w:r>
+        <w:rPr>
+          <w:rFonts w:ascii="Calibri" w:hAnsi="Calibri"/>
+          <w:b/>
+          <w:color w:val="1F4D78"/>
+          <w:sz w:val="23"/>
+        </w:rPr>
+        <w:t>PATCH /rider/{riderId}/verification</w:t>
+      </w:r>
+    </w:p>
+    <w:p>
+      <w:pPr>
+        <w:spacing w:before="0" w:after="60" w:line="283" w:lineRule="auto"/>
+      </w:pPr>
+      <w:r>
+        <w:rPr>
+          <w:rFonts w:ascii="Calibri" w:hAnsi="Calibri"/>
+          <w:b/>
+          <w:color w:val="1F4D78"/>
+          <w:sz w:val="18"/>
+        </w:rPr>
+        <w:t xml:space="preserve">Authentication: </w:t>
+      </w:r>
+      <w:r>
+        <w:rPr>
+          <w:rFonts w:ascii="Calibri" w:hAnsi="Calibri"/>
+          <w:b w:val="0"/>
+          <w:sz w:val="18"/>
+        </w:rPr>
+        <w:t>Bearer JWT</w:t>
+      </w:r>
+      <w:r>
+        <w:rPr>
+          <w:rFonts w:ascii="Calibri" w:hAnsi="Calibri"/>
+          <w:b/>
+          <w:color w:val="1F4D78"/>
+          <w:sz w:val="18"/>
+        </w:rPr>
+        <w:t xml:space="preserve">   |   Request type: </w:t>
+      </w:r>
+      <w:r>
+        <w:rPr>
+          <w:rFonts w:ascii="Calibri" w:hAnsi="Calibri"/>
+          <w:b w:val="0"/>
+          <w:sz w:val="18"/>
+        </w:rPr>
+        <w:t>Boolean query parameter</w:t>
+      </w:r>
+    </w:p>
+    <w:p>
+      <w:pPr>
+        <w:spacing w:before="0" w:after="40" w:line="283" w:lineRule="auto"/>
+      </w:pPr>
+      <w:r>
+        <w:rPr>
+          <w:rFonts w:ascii="Calibri" w:hAnsi="Calibri"/>
+          <w:b/>
+          <w:color w:val="1F4D78"/>
+          <w:sz w:val="18"/>
+        </w:rPr>
+        <w:t>Postman test</w:t>
       </w:r>
     </w:p>
     <w:p>
@@ -12264,7 +12994,137 @@
           <w:color w:val="1F4D78"/>
           <w:sz w:val="16"/>
         </w:rPr>
+        <w:t>PATCH {{baseUrl}}/rider/{{riderId}}/verification?verified=true</w:t>
+      </w:r>
+    </w:p>
+    <w:p>
+      <w:pPr>
+        <w:keepLines/>
+        <w:spacing w:after="60" w:line="240" w:lineRule="auto"/>
+        <w:ind w:left="230" w:right="115"/>
+        <w:shd w:fill="F5F8FC"/>
+      </w:pPr>
+      <w:r>
+        <w:rPr>
+          <w:rFonts w:ascii="Consolas" w:hAnsi="Consolas"/>
+          <w:b w:val="0"/>
+          <w:color w:val="1F4D78"/>
+          <w:sz w:val="16"/>
+        </w:rPr>
         <w:t>Authorization: Bearer {{adminJwt}}</w:t>
+      </w:r>
+    </w:p>
+    <w:p>
+      <w:pPr>
+        <w:spacing w:before="0" w:after="100" w:line="283" w:lineRule="auto"/>
+      </w:pPr>
+      <w:r>
+        <w:rPr>
+          <w:rFonts w:ascii="Calibri" w:hAnsi="Calibri"/>
+          <w:b/>
+          <w:color w:val="1F4D78"/>
+          <w:sz w:val="18"/>
+        </w:rPr>
+        <w:t xml:space="preserve">Expected result: </w:t>
+      </w:r>
+      <w:r>
+        <w:rPr>
+          <w:rFonts w:ascii="Calibri" w:hAnsi="Calibri"/>
+          <w:b w:val="0"/>
+          <w:sz w:val="18"/>
+        </w:rPr>
+        <w:t>200 OK with the verification object where verified is true.</w:t>
+      </w:r>
+    </w:p>
+    <w:p>
+      <w:pPr>
+        <w:spacing w:before="0" w:after="120" w:line="283" w:lineRule="auto"/>
+      </w:pPr>
+      <w:r>
+        <w:rPr>
+          <w:rFonts w:ascii="Calibri" w:hAnsi="Calibri"/>
+          <w:b/>
+          <w:color w:val="9C6500"/>
+          <w:sz w:val="18"/>
+        </w:rPr>
+        <w:t xml:space="preserve">Note: </w:t>
+      </w:r>
+      <w:r>
+        <w:rPr>
+          <w:rFonts w:ascii="Calibri" w:hAnsi="Calibri"/>
+          <w:b w:val="0"/>
+          <w:color w:val="9C6500"/>
+          <w:sz w:val="18"/>
+        </w:rPr>
+        <w:t>Use true or false, not Y/N. Verified must be true before matching can return the rider.</w:t>
+      </w:r>
+    </w:p>
+    <w:p>
+      <w:pPr>
+        <w:keepNext/>
+        <w:spacing w:before="160" w:after="100"/>
+      </w:pPr>
+      <w:r>
+        <w:rPr>
+          <w:rFonts w:ascii="Calibri" w:hAnsi="Calibri"/>
+          <w:b/>
+          <w:color w:val="1F4D78"/>
+          <w:sz w:val="23"/>
+        </w:rPr>
+        <w:t>GET /rider/{riderId}/history</w:t>
+      </w:r>
+    </w:p>
+    <w:p>
+      <w:pPr>
+        <w:spacing w:before="0" w:after="60" w:line="283" w:lineRule="auto"/>
+      </w:pPr>
+      <w:r>
+        <w:rPr>
+          <w:rFonts w:ascii="Calibri" w:hAnsi="Calibri"/>
+          <w:b/>
+          <w:color w:val="1F4D78"/>
+          <w:sz w:val="18"/>
+        </w:rPr>
+        <w:t xml:space="preserve">Authentication: </w:t>
+      </w:r>
+      <w:r>
+        <w:rPr>
+          <w:rFonts w:ascii="Calibri" w:hAnsi="Calibri"/>
+          <w:b w:val="0"/>
+          <w:sz w:val="18"/>
+        </w:rPr>
+        <w:t>Bearer JWT</w:t>
+      </w:r>
+      <w:r>
+        <w:rPr>
+          <w:rFonts w:ascii="Calibri" w:hAnsi="Calibri"/>
+          <w:b/>
+          <w:color w:val="1F4D78"/>
+          <w:sz w:val="18"/>
+        </w:rPr>
+        <w:t xml:space="preserve">   |   Request type: </w:t>
+      </w:r>
+      <w:r>
+        <w:rPr>
+          <w:rFonts w:ascii="Calibri" w:hAnsi="Calibri"/>
+          <w:b w:val="0"/>
+          <w:sz w:val="18"/>
+        </w:rPr>
+        <w:t>No body</w:t>
+      </w:r>
+    </w:p>
+    <w:p>
+      <w:pPr>
+        <w:spacing w:before="0" w:after="40" w:line="283" w:lineRule="auto"/>
+      </w:pPr>
+      <w:r>
+        <w:rPr>
+          <w:rFonts w:ascii="Calibri" w:hAnsi="Calibri"/>
+          <w:b/>
+          <w:color w:val="1F4D78"/>
+          <w:sz w:val="18"/>
+        </w:rPr>
+        <w:t>Postman test</w:t>
       </w:r>
     </w:p>
     <w:p>
@@ -12281,7 +13141,114 @@
           <w:color w:val="1F4D78"/>
           <w:sz w:val="16"/>
         </w:rPr>
-        <w:t>Content-Type: application/json</w:t>
+        <w:t>GET {{baseUrl}}/rider/{{riderId}}/history</w:t>
+      </w:r>
+    </w:p>
+    <w:p>
+      <w:pPr>
+        <w:keepLines/>
+        <w:spacing w:after="60" w:line="240" w:lineRule="auto"/>
+        <w:ind w:left="230" w:right="115"/>
+        <w:shd w:fill="F5F8FC"/>
+      </w:pPr>
+      <w:r>
+        <w:rPr>
+          <w:rFonts w:ascii="Consolas" w:hAnsi="Consolas"/>
+          <w:b w:val="0"/>
+          <w:color w:val="1F4D78"/>
+          <w:sz w:val="16"/>
+        </w:rPr>
+        <w:t>Authorization: Bearer {{riderJwt}}</w:t>
+      </w:r>
+    </w:p>
+    <w:p>
+      <w:pPr>
+        <w:spacing w:before="0" w:after="100" w:line="283" w:lineRule="auto"/>
+      </w:pPr>
+      <w:r>
+        <w:rPr>
+          <w:rFonts w:ascii="Calibri" w:hAnsi="Calibri"/>
+          <w:b/>
+          <w:color w:val="1F4D78"/>
+          <w:sz w:val="18"/>
+        </w:rPr>
+        <w:t xml:space="preserve">Expected result: </w:t>
+      </w:r>
+      <w:r>
+        <w:rPr>
+          <w:rFonts w:ascii="Calibri" w:hAnsi="Calibri"/>
+          <w:b w:val="0"/>
+          <w:sz w:val="18"/>
+        </w:rPr>
+        <w:t>200 OK with an array of rides whose RIDER_ID equals the path value, newest ride ID first.</w:t>
+      </w:r>
+    </w:p>
+    <w:p>
+      <w:pPr>
+        <w:keepNext/>
+        <w:spacing w:before="160" w:after="100"/>
+      </w:pPr>
+      <w:r>
+        <w:rPr>
+          <w:rFonts w:ascii="Calibri" w:hAnsi="Calibri"/>
+          <w:b/>
+          <w:color w:val="1F4D78"/>
+          <w:sz w:val="23"/>
+        </w:rPr>
+        <w:t>PATCH /rider/status</w:t>
+      </w:r>
+    </w:p>
+    <w:p>
+      <w:pPr>
+        <w:spacing w:before="0" w:after="60" w:line="283" w:lineRule="auto"/>
+      </w:pPr>
+      <w:r>
+        <w:rPr>
+          <w:rFonts w:ascii="Calibri" w:hAnsi="Calibri"/>
+          <w:b/>
+          <w:color w:val="1F4D78"/>
+          <w:sz w:val="18"/>
+        </w:rPr>
+        <w:t xml:space="preserve">Authentication: </w:t>
+      </w:r>
+      <w:r>
+        <w:rPr>
+          <w:rFonts w:ascii="Calibri" w:hAnsi="Calibri"/>
+          <w:b w:val="0"/>
+          <w:sz w:val="18"/>
+        </w:rPr>
+        <w:t>Bearer {{riderJwt}} — RIDER role</w:t>
+      </w:r>
+      <w:r>
+        <w:rPr>
+          <w:rFonts w:ascii="Calibri" w:hAnsi="Calibri"/>
+          <w:b/>
+          <w:color w:val="1F4D78"/>
+          <w:sz w:val="18"/>
+        </w:rPr>
+        <w:t xml:space="preserve">   |   Request type: </w:t>
+      </w:r>
+      <w:r>
+        <w:rPr>
+          <w:rFonts w:ascii="Calibri" w:hAnsi="Calibri"/>
+          <w:b w:val="0"/>
+          <w:sz w:val="18"/>
+        </w:rPr>
+        <w:t>status query parameter</w:t>
+      </w:r>
+    </w:p>
+    <w:p>
+      <w:pPr>
+        <w:spacing w:before="0" w:after="40" w:line="283" w:lineRule="auto"/>
+      </w:pPr>
+      <w:r>
+        <w:rPr>
+          <w:rFonts w:ascii="Calibri" w:hAnsi="Calibri"/>
+          <w:b/>
+          <w:color w:val="1F4D78"/>
+          <w:sz w:val="18"/>
+        </w:rPr>
+        <w:t>Postman test</w:t>
       </w:r>
     </w:p>
     <w:p>
@@ -12298,7 +13265,193 @@
           <w:color w:val="1F4D78"/>
           <w:sz w:val="16"/>
         </w:rPr>
-        <w:t xml:space="preserve"> </w:t>
+        <w:t>PATCH {{baseUrl}}/rider/status?status=OFFLINE</w:t>
+      </w:r>
+    </w:p>
+    <w:p>
+      <w:pPr>
+        <w:keepLines/>
+        <w:spacing w:after="60" w:line="240" w:lineRule="auto"/>
+        <w:ind w:left="230" w:right="115"/>
+        <w:shd w:fill="F5F8FC"/>
+      </w:pPr>
+      <w:r>
+        <w:rPr>
+          <w:rFonts w:ascii="Consolas" w:hAnsi="Consolas"/>
+          <w:b w:val="0"/>
+          <w:color w:val="1F4D78"/>
+          <w:sz w:val="16"/>
+        </w:rPr>
+        <w:t>Authorization: Bearer {{riderJwt}}</w:t>
+      </w:r>
+    </w:p>
+    <w:p>
+      <w:pPr>
+        <w:spacing w:before="0" w:after="0" w:line="283" w:lineRule="auto"/>
+      </w:pPr>
+      <w:r>
+        <w:rPr>
+          <w:rFonts w:ascii="Calibri" w:hAnsi="Calibri"/>
+          <w:b/>
+          <w:color w:val="1F4D78"/>
+          <w:sz w:val="18"/>
+        </w:rPr>
+        <w:t xml:space="preserve">Expected result: </w:t>
+      </w:r>
+      <w:r>
+        <w:rPr>
+          <w:rFonts w:ascii="Calibri" w:hAnsi="Calibri"/>
+          <w:b w:val="0"/>
+          <w:sz w:val="18"/>
+        </w:rPr>
+        <w:t>200 OK</w:t>
+      </w:r>
+    </w:p>
+    <w:p>
+      <w:pPr>
+        <w:keepLines/>
+        <w:spacing w:before="0" w:after="0" w:line="283" w:lineRule="auto"/>
+      </w:pPr>
+      <w:r>
+        <w:rPr>
+          <w:rFonts w:ascii="Calibri" w:hAnsi="Calibri"/>
+          <w:b w:val="0"/>
+          <w:sz w:val="18"/>
+        </w:rPr>
+        <w:t>{</w:t>
+      </w:r>
+    </w:p>
+    <w:p>
+      <w:pPr>
+        <w:keepLines/>
+        <w:spacing w:before="0" w:after="0" w:line="283" w:lineRule="auto"/>
+      </w:pPr>
+      <w:r>
+        <w:rPr>
+          <w:rFonts w:ascii="Calibri" w:hAnsi="Calibri"/>
+          <w:b w:val="0"/>
+          <w:sz w:val="18"/>
+        </w:rPr>
+        <w:t xml:space="preserve">  "riderId": 3,</w:t>
+      </w:r>
+    </w:p>
+    <w:p>
+      <w:pPr>
+        <w:keepLines/>
+        <w:spacing w:before="0" w:after="0" w:line="283" w:lineRule="auto"/>
+      </w:pPr>
+      <w:r>
+        <w:rPr>
+          <w:rFonts w:ascii="Calibri" w:hAnsi="Calibri"/>
+          <w:b w:val="0"/>
+          <w:sz w:val="18"/>
+        </w:rPr>
+        <w:t xml:space="preserve">  "status": "OFFLINE"</w:t>
+      </w:r>
+    </w:p>
+    <w:p>
+      <w:pPr>
+        <w:keepLines/>
+        <w:spacing w:before="0" w:after="100" w:line="283" w:lineRule="auto"/>
+      </w:pPr>
+      <w:r>
+        <w:rPr>
+          <w:rFonts w:ascii="Calibri" w:hAnsi="Calibri"/>
+          <w:b w:val="0"/>
+          <w:sz w:val="18"/>
+        </w:rPr>
+        <w:t>}</w:t>
+      </w:r>
+    </w:p>
+    <w:p>
+      <w:pPr>
+        <w:spacing w:before="0" w:after="120" w:line="283" w:lineRule="auto"/>
+      </w:pPr>
+      <w:r>
+        <w:rPr>
+          <w:rFonts w:ascii="Calibri" w:hAnsi="Calibri"/>
+          <w:b/>
+          <w:color w:val="9C6500"/>
+          <w:sz w:val="18"/>
+        </w:rPr>
+        <w:t xml:space="preserve">Note: </w:t>
+      </w:r>
+      <w:r>
+        <w:rPr>
+          <w:rFonts w:ascii="Calibri" w:hAnsi="Calibri"/>
+          <w:b w:val="0"/>
+          <w:color w:val="9C6500"/>
+          <w:sz w:val="18"/>
+        </w:rPr>
+        <w:t>Use only AVAILABLE or OFFLINE. The server identifies the rider from the JWT, so the client cannot update another rider's status. ON_TRIP is controlled by ride acceptance/lifecycle; a rider with an active assignment cannot change availability. OFFLINE and ON_TRIP riders are excluded from matching.</w:t>
+      </w:r>
+    </w:p>
+    <w:p>
+      <w:pPr>
+        <w:keepNext/>
+        <w:spacing w:before="160" w:after="100"/>
+      </w:pPr>
+      <w:r>
+        <w:rPr>
+          <w:rFonts w:ascii="Calibri" w:hAnsi="Calibri"/>
+          <w:b/>
+          <w:color w:val="1F4D78"/>
+          <w:sz w:val="23"/>
+        </w:rPr>
+        <w:t>POST /rider/save/location</w:t>
+      </w:r>
+    </w:p>
+    <w:p>
+      <w:pPr>
+        <w:spacing w:before="0" w:after="60" w:line="283" w:lineRule="auto"/>
+      </w:pPr>
+      <w:r>
+        <w:rPr>
+          <w:rFonts w:ascii="Calibri" w:hAnsi="Calibri"/>
+          <w:b/>
+          <w:color w:val="1F4D78"/>
+          <w:sz w:val="18"/>
+        </w:rPr>
+        <w:t xml:space="preserve">Authentication: </w:t>
+      </w:r>
+      <w:r>
+        <w:rPr>
+          <w:rFonts w:ascii="Calibri" w:hAnsi="Calibri"/>
+          <w:b w:val="0"/>
+          <w:sz w:val="18"/>
+        </w:rPr>
+        <w:t>Bearer {{riderJwt}} — RIDER role</w:t>
+      </w:r>
+      <w:r>
+        <w:rPr>
+          <w:rFonts w:ascii="Calibri" w:hAnsi="Calibri"/>
+          <w:b/>
+          <w:color w:val="1F4D78"/>
+          <w:sz w:val="18"/>
+        </w:rPr>
+        <w:t xml:space="preserve">   |   Request type: </w:t>
+      </w:r>
+      <w:r>
+        <w:rPr>
+          <w:rFonts w:ascii="Calibri" w:hAnsi="Calibri"/>
+          <w:b w:val="0"/>
+          <w:sz w:val="18"/>
+        </w:rPr>
+        <w:t>raw JSON</w:t>
+      </w:r>
+    </w:p>
+    <w:p>
+      <w:pPr>
+        <w:spacing w:before="0" w:after="40" w:line="283" w:lineRule="auto"/>
+      </w:pPr>
+      <w:r>
+        <w:rPr>
+          <w:rFonts w:ascii="Calibri" w:hAnsi="Calibri"/>
+          <w:b/>
+          <w:color w:val="1F4D78"/>
+          <w:sz w:val="18"/>
+        </w:rPr>
+        <w:t>Postman test</w:t>
       </w:r>
     </w:p>
     <w:p>
@@ -12315,7 +13468,7 @@
           <w:color w:val="1F4D78"/>
           <w:sz w:val="16"/>
         </w:rPr>
-        <w:t>{</w:t>
+        <w:t>POST {{baseUrl}}/rider/save/location</w:t>
       </w:r>
     </w:p>
     <w:p>
@@ -12332,7 +13485,7 @@
           <w:color w:val="1F4D78"/>
           <w:sz w:val="16"/>
         </w:rPr>
-        <w:t xml:space="preserve">  "aadhaarCardNumber": "123456789013",</w:t>
+        <w:t>Authorization: Bearer {{riderJwt}}</w:t>
       </w:r>
     </w:p>
     <w:p>
@@ -12349,7 +13502,7 @@
           <w:color w:val="1F4D78"/>
           <w:sz w:val="16"/>
         </w:rPr>
-        <w:t xml:space="preserve">  "panCardNumber": "ABCDE1234F",</w:t>
+        <w:t>Content-Type: application/json</w:t>
       </w:r>
     </w:p>
     <w:p>
@@ -12366,7 +13519,7 @@
           <w:color w:val="1F4D78"/>
           <w:sz w:val="16"/>
         </w:rPr>
-        <w:t xml:space="preserve">  "drivingLicenseNumber": "MH0120230001234",</w:t>
+        <w:t xml:space="preserve"> </w:t>
       </w:r>
     </w:p>
     <w:p>
@@ -12383,7 +13536,7 @@
           <w:color w:val="1F4D78"/>
           <w:sz w:val="16"/>
         </w:rPr>
-        <w:t xml:space="preserve">  "bankAccountNumber": "123456789012",</w:t>
+        <w:t>{</w:t>
       </w:r>
     </w:p>
     <w:p>
@@ -12400,7 +13553,7 @@
           <w:color w:val="1F4D78"/>
           <w:sz w:val="16"/>
         </w:rPr>
-        <w:t xml:space="preserve">  "bankIfscCode": "HDFC0001234",</w:t>
+        <w:t xml:space="preserve">  "latitude": 19.0770,</w:t>
       </w:r>
     </w:p>
     <w:p>
@@ -12417,7 +13570,7 @@
           <w:color w:val="1F4D78"/>
           <w:sz w:val="16"/>
         </w:rPr>
-        <w:t xml:space="preserve">  "bankAccountName": "Vijay Rider"</w:t>
+        <w:t xml:space="preserve">  "longitude": 72.8777</w:t>
       </w:r>
     </w:p>
     <w:p>
@@ -12456,7 +13609,7 @@
           <w:b w:val="0"/>
           <w:sz w:val="18"/>
         </w:rPr>
-        <w:t>201 Created</w:t>
+        <w:t>200 OK</w:t>
       </w:r>
     </w:p>
     <w:p>
@@ -12484,7 +13637,7 @@
           <w:b w:val="0"/>
           <w:sz w:val="18"/>
         </w:rPr>
-        <w:t xml:space="preserve">  "riderId":3,</w:t>
+        <w:t xml:space="preserve">  "type":"RIDER_LOCATION_SAVED",</w:t>
       </w:r>
     </w:p>
     <w:p>
@@ -12498,7 +13651,7 @@
           <w:b w:val="0"/>
           <w:sz w:val="18"/>
         </w:rPr>
-        <w:t xml:space="preserve">  "aadhaarCardNumber":"123456789013",</w:t>
+        <w:t xml:space="preserve">  "riderId":3,</w:t>
       </w:r>
     </w:p>
     <w:p>
@@ -12512,7 +13665,7 @@
           <w:b w:val="0"/>
           <w:sz w:val="18"/>
         </w:rPr>
-        <w:t xml:space="preserve">  "panCardNumber":"ABCDE1234F",</w:t>
+        <w:t xml:space="preserve">  "latitude":19.077,</w:t>
       </w:r>
     </w:p>
     <w:p>
@@ -12526,63 +13679,7 @@
           <w:b w:val="0"/>
           <w:sz w:val="18"/>
         </w:rPr>
-        <w:t xml:space="preserve">  "drivingLicenseNumber":"MH0120230001234",</w:t>
-      </w:r>
-    </w:p>
-    <w:p>
-      <w:pPr>
-        <w:keepLines/>
-        <w:spacing w:before="0" w:after="0" w:line="283" w:lineRule="auto"/>
-      </w:pPr>
-      <w:r>
-        <w:rPr>
-          <w:rFonts w:ascii="Calibri" w:hAnsi="Calibri"/>
-          <w:b w:val="0"/>
-          <w:sz w:val="18"/>
-        </w:rPr>
-        <w:t xml:space="preserve">  "bankAccountNumber":"123456789012",</w:t>
-      </w:r>
-    </w:p>
-    <w:p>
-      <w:pPr>
-        <w:keepLines/>
-        <w:spacing w:before="0" w:after="0" w:line="283" w:lineRule="auto"/>
-      </w:pPr>
-      <w:r>
-        <w:rPr>
-          <w:rFonts w:ascii="Calibri" w:hAnsi="Calibri"/>
-          <w:b w:val="0"/>
-          <w:sz w:val="18"/>
-        </w:rPr>
-        <w:t xml:space="preserve">  "bankIfscCode":"HDFC0001234",</w:t>
-      </w:r>
-    </w:p>
-    <w:p>
-      <w:pPr>
-        <w:keepLines/>
-        <w:spacing w:before="0" w:after="0" w:line="283" w:lineRule="auto"/>
-      </w:pPr>
-      <w:r>
-        <w:rPr>
-          <w:rFonts w:ascii="Calibri" w:hAnsi="Calibri"/>
-          <w:b w:val="0"/>
-          <w:sz w:val="18"/>
-        </w:rPr>
-        <w:t xml:space="preserve">  "bankAccountName":"Vijay Rider",</w:t>
-      </w:r>
-    </w:p>
-    <w:p>
-      <w:pPr>
-        <w:keepLines/>
-        <w:spacing w:before="0" w:after="0" w:line="283" w:lineRule="auto"/>
-      </w:pPr>
-      <w:r>
-        <w:rPr>
-          <w:rFonts w:ascii="Calibri" w:hAnsi="Calibri"/>
-          <w:b w:val="0"/>
-          <w:sz w:val="18"/>
-        </w:rPr>
-        <w:t xml:space="preserve">  "verified":false</w:t>
+        <w:t xml:space="preserve">  "longitude":72.8777</w:t>
       </w:r>
     </w:p>
     <w:p>
@@ -12619,7 +13716,7 @@
           <w:color w:val="9C6500"/>
           <w:sz w:val="18"/>
         </w:rPr>
-        <w:t>The rider ID comes only from the URL path. For rider 3, call /rider/3/verification-details. The body must not contain riderId. Saving again updates that same rider record and resets verified to false.</w:t>
+        <w:t>No rideId or riderId is sent. The server derives riderId from the JWT → USERS → RIDER_DETAILS.USER_ID mapping, then atomically upserts the current rider location. This endpoint works before a ride is assigned.</w:t>
       </w:r>
     </w:p>
     <w:p>
@@ -12634,7 +13731,7 @@
           <w:color w:val="1F4D78"/>
           <w:sz w:val="23"/>
         </w:rPr>
-        <w:t>GET /rider/{riderId}/verification-details</w:t>
+        <w:t>GET /rider/nearby</w:t>
       </w:r>
     </w:p>
     <w:p>
@@ -12673,7 +13770,7 @@
           <w:b w:val="0"/>
           <w:sz w:val="18"/>
         </w:rPr>
-        <w:t>No body</w:t>
+        <w:t>Query parameters</w:t>
       </w:r>
     </w:p>
     <w:p>
@@ -12704,7 +13801,7 @@
           <w:color w:val="1F4D78"/>
           <w:sz w:val="16"/>
         </w:rPr>
-        <w:t>GET {{baseUrl}}/rider/{{riderId}}/verification-details</w:t>
+        <w:t>GET {{baseUrl}}/rider/nearby?lat=19.0760&amp;lon=72.8777</w:t>
       </w:r>
     </w:p>
     <w:p>
@@ -12743,7 +13840,7 @@
           <w:b w:val="0"/>
           <w:sz w:val="18"/>
         </w:rPr>
-        <w:t>200 OK with the stored verification JSON.</w:t>
+        <w:t>200 OK with a rider-ID array, for example [3].</w:t>
       </w:r>
     </w:p>
     <w:p>
@@ -12766,7 +13863,22 @@
           <w:color w:val="9C6500"/>
           <w:sz w:val="18"/>
         </w:rPr>
-        <w:t>This currently exposes unmasked KYC/bank fields. Do not expose this endpoint to untrusted clients in production.</w:t>
+        <w:t>A rider is returned only when location is newer than 10 minutes, status is AVAILABLE, verification is true, and Haversine distance is &lt;= 10 km.</w:t>
+      </w:r>
+    </w:p>
+    <w:p>
+      <w:pPr>
+        <w:keepNext/>
+        <w:spacing w:before="320" w:after="140"/>
+      </w:pPr>
+      <w:r>
+        <w:rPr>
+          <w:rFonts w:ascii="Calibri" w:hAnsi="Calibri"/>
+          <w:b/>
+          <w:color w:val="2E74B5"/>
+          <w:sz w:val="32"/>
+        </w:rPr>
+        <w:t>7. Ride request, acceptance, and live tracking</w:t>
       </w:r>
     </w:p>
     <w:p>
@@ -12781,7 +13893,7 @@
           <w:color w:val="1F4D78"/>
           <w:sz w:val="23"/>
         </w:rPr>
-        <w:t>PATCH /rider/{riderId}/verification</w:t>
+        <w:t>POST /ride/request</w:t>
       </w:r>
     </w:p>
     <w:p>
@@ -12803,7 +13915,7 @@
           <w:b w:val="0"/>
           <w:sz w:val="18"/>
         </w:rPr>
-        <w:t>Bearer JWT</w:t>
+        <w:t>Bearer {{adminJwt}} — ADMIN role</w:t>
       </w:r>
       <w:r>
         <w:rPr>
@@ -12820,7 +13932,7 @@
           <w:b w:val="0"/>
           <w:sz w:val="18"/>
         </w:rPr>
-        <w:t>Boolean query parameter</w:t>
+        <w:t>raw JSON</w:t>
       </w:r>
     </w:p>
     <w:p>
@@ -12851,7 +13963,211 @@
           <w:color w:val="1F4D78"/>
           <w:sz w:val="16"/>
         </w:rPr>
-        <w:t>PATCH {{baseUrl}}/rider/{{riderId}}/verification?verified=true</w:t>
+        <w:t>POST {{baseUrl}}/ride/request</w:t>
+      </w:r>
+    </w:p>
+    <w:p>
+      <w:pPr>
+        <w:keepLines/>
+        <w:spacing w:after="0" w:line="240" w:lineRule="auto"/>
+        <w:ind w:left="230" w:right="115"/>
+        <w:shd w:fill="F5F8FC"/>
+      </w:pPr>
+      <w:r>
+        <w:rPr>
+          <w:rFonts w:ascii="Consolas" w:hAnsi="Consolas"/>
+          <w:b w:val="0"/>
+          <w:color w:val="1F4D78"/>
+          <w:sz w:val="16"/>
+        </w:rPr>
+        <w:t>Authorization: Bearer {{adminJwt}}</w:t>
+      </w:r>
+    </w:p>
+    <w:p>
+      <w:pPr>
+        <w:keepLines/>
+        <w:spacing w:after="0" w:line="240" w:lineRule="auto"/>
+        <w:ind w:left="230" w:right="115"/>
+        <w:shd w:fill="F5F8FC"/>
+      </w:pPr>
+      <w:r>
+        <w:rPr>
+          <w:rFonts w:ascii="Consolas" w:hAnsi="Consolas"/>
+          <w:b w:val="0"/>
+          <w:color w:val="1F4D78"/>
+          <w:sz w:val="16"/>
+        </w:rPr>
+        <w:t>Content-Type: application/json</w:t>
+      </w:r>
+    </w:p>
+    <w:p>
+      <w:pPr>
+        <w:keepLines/>
+        <w:spacing w:after="0" w:line="240" w:lineRule="auto"/>
+        <w:ind w:left="230" w:right="115"/>
+        <w:shd w:fill="F5F8FC"/>
+      </w:pPr>
+      <w:r>
+        <w:rPr>
+          <w:rFonts w:ascii="Consolas" w:hAnsi="Consolas"/>
+          <w:b w:val="0"/>
+          <w:color w:val="1F4D78"/>
+          <w:sz w:val="16"/>
+        </w:rPr>
+        <w:t xml:space="preserve"> </w:t>
+      </w:r>
+    </w:p>
+    <w:p>
+      <w:pPr>
+        <w:keepLines/>
+        <w:spacing w:after="0" w:line="240" w:lineRule="auto"/>
+        <w:ind w:left="230" w:right="115"/>
+        <w:shd w:fill="F5F8FC"/>
+      </w:pPr>
+      <w:r>
+        <w:rPr>
+          <w:rFonts w:ascii="Consolas" w:hAnsi="Consolas"/>
+          <w:b w:val="0"/>
+          <w:color w:val="1F4D78"/>
+          <w:sz w:val="16"/>
+        </w:rPr>
+        <w:t>{</w:t>
+      </w:r>
+    </w:p>
+    <w:p>
+      <w:pPr>
+        <w:keepLines/>
+        <w:spacing w:after="0" w:line="240" w:lineRule="auto"/>
+        <w:ind w:left="230" w:right="115"/>
+        <w:shd w:fill="F5F8FC"/>
+      </w:pPr>
+      <w:r>
+        <w:rPr>
+          <w:rFonts w:ascii="Consolas" w:hAnsi="Consolas"/>
+          <w:b w:val="0"/>
+          <w:color w:val="1F4D78"/>
+          <w:sz w:val="16"/>
+        </w:rPr>
+        <w:t xml:space="preserve">  "pickUpLatitude": 19.0760,</w:t>
+      </w:r>
+    </w:p>
+    <w:p>
+      <w:pPr>
+        <w:keepLines/>
+        <w:spacing w:after="0" w:line="240" w:lineRule="auto"/>
+        <w:ind w:left="230" w:right="115"/>
+        <w:shd w:fill="F5F8FC"/>
+      </w:pPr>
+      <w:r>
+        <w:rPr>
+          <w:rFonts w:ascii="Consolas" w:hAnsi="Consolas"/>
+          <w:b w:val="0"/>
+          <w:color w:val="1F4D78"/>
+          <w:sz w:val="16"/>
+        </w:rPr>
+        <w:t xml:space="preserve">  "pickUpLongitude": 72.8777,</w:t>
+      </w:r>
+    </w:p>
+    <w:p>
+      <w:pPr>
+        <w:keepLines/>
+        <w:spacing w:after="0" w:line="240" w:lineRule="auto"/>
+        <w:ind w:left="230" w:right="115"/>
+        <w:shd w:fill="F5F8FC"/>
+      </w:pPr>
+      <w:r>
+        <w:rPr>
+          <w:rFonts w:ascii="Consolas" w:hAnsi="Consolas"/>
+          <w:b w:val="0"/>
+          <w:color w:val="1F4D78"/>
+          <w:sz w:val="16"/>
+        </w:rPr>
+        <w:t xml:space="preserve">  "dropLatitude": 19.1100,</w:t>
+      </w:r>
+    </w:p>
+    <w:p>
+      <w:pPr>
+        <w:keepLines/>
+        <w:spacing w:after="0" w:line="240" w:lineRule="auto"/>
+        <w:ind w:left="230" w:right="115"/>
+        <w:shd w:fill="F5F8FC"/>
+      </w:pPr>
+      <w:r>
+        <w:rPr>
+          <w:rFonts w:ascii="Consolas" w:hAnsi="Consolas"/>
+          <w:b w:val="0"/>
+          <w:color w:val="1F4D78"/>
+          <w:sz w:val="16"/>
+        </w:rPr>
+        <w:t xml:space="preserve">  "dropLongitude": 72.9000,</w:t>
+      </w:r>
+    </w:p>
+    <w:p>
+      <w:pPr>
+        <w:keepLines/>
+        <w:spacing w:after="0" w:line="240" w:lineRule="auto"/>
+        <w:ind w:left="230" w:right="115"/>
+        <w:shd w:fill="F5F8FC"/>
+      </w:pPr>
+      <w:r>
+        <w:rPr>
+          <w:rFonts w:ascii="Consolas" w:hAnsi="Consolas"/>
+          <w:b w:val="0"/>
+          <w:color w:val="1F4D78"/>
+          <w:sz w:val="16"/>
+        </w:rPr>
+        <w:t xml:space="preserve">  "fare": 125.00,</w:t>
+      </w:r>
+    </w:p>
+    <w:p>
+      <w:pPr>
+        <w:keepLines/>
+        <w:spacing w:after="0" w:line="240" w:lineRule="auto"/>
+        <w:ind w:left="230" w:right="115"/>
+        <w:shd w:fill="F5F8FC"/>
+      </w:pPr>
+      <w:r>
+        <w:rPr>
+          <w:rFonts w:ascii="Consolas" w:hAnsi="Consolas"/>
+          <w:b w:val="0"/>
+          <w:color w:val="1F4D78"/>
+          <w:sz w:val="16"/>
+        </w:rPr>
+        <w:t xml:space="preserve">  "chassisNo": "MBLHA10A1NHB12345",</w:t>
+      </w:r>
+    </w:p>
+    <w:p>
+      <w:pPr>
+        <w:keepLines/>
+        <w:spacing w:after="0" w:line="240" w:lineRule="auto"/>
+        <w:ind w:left="230" w:right="115"/>
+        <w:shd w:fill="F5F8FC"/>
+      </w:pPr>
+      <w:r>
+        <w:rPr>
+          <w:rFonts w:ascii="Consolas" w:hAnsi="Consolas"/>
+          <w:b w:val="0"/>
+          <w:color w:val="1F4D78"/>
+          <w:sz w:val="16"/>
+        </w:rPr>
+        <w:t xml:space="preserve">  "vehicleName": "Honda Activa 6G",</w:t>
+      </w:r>
+    </w:p>
+    <w:p>
+      <w:pPr>
+        <w:keepLines/>
+        <w:spacing w:after="0" w:line="240" w:lineRule="auto"/>
+        <w:ind w:left="230" w:right="115"/>
+        <w:shd w:fill="F5F8FC"/>
+      </w:pPr>
+      <w:r>
+        <w:rPr>
+          <w:rFonts w:ascii="Consolas" w:hAnsi="Consolas"/>
+          <w:b w:val="0"/>
+          <w:color w:val="1F4D78"/>
+          <w:sz w:val="16"/>
+        </w:rPr>
+        <w:t xml:space="preserve">  "adminId": {{adminId}}</w:t>
       </w:r>
     </w:p>
     <w:p>
@@ -12868,7 +14184,7 @@
           <w:color w:val="1F4D78"/>
           <w:sz w:val="16"/>
         </w:rPr>
-        <w:t>Authorization: Bearer {{adminJwt}}</w:t>
+        <w:t>}</w:t>
       </w:r>
     </w:p>
     <w:p>
@@ -12890,7 +14206,7 @@
           <w:b w:val="0"/>
           <w:sz w:val="18"/>
         </w:rPr>
-        <w:t>200 OK with the verification object where verified is true.</w:t>
+        <w:t>200 OK with plain text: Ride Request Sent, id=2</w:t>
       </w:r>
     </w:p>
     <w:p>
@@ -12913,7 +14229,7 @@
           <w:color w:val="9C6500"/>
           <w:sz w:val="18"/>
         </w:rPr>
-        <w:t>Use true or false, not Y/N. Verified must be true before matching can return the rider.</w:t>
+        <w:t>chassisNo and vehicleName are required and stored on RIDE_DETAILS. Copy the returned number to {{rideId}}. The server creates a 4-digit ride OTP, sets status REQUESTED, finds eligible riders, saves RIDE_REQUEST rows, and publishes RIDE_REQUEST events. Do not send rideId, riderId, rideOtp, or rideStatus in the body.</w:t>
       </w:r>
     </w:p>
     <w:p>
@@ -12928,7 +14244,7 @@
           <w:color w:val="1F4D78"/>
           <w:sz w:val="23"/>
         </w:rPr>
-        <w:t>GET /rider/{riderId}/history</w:t>
+        <w:t>POST /ride/accept</w:t>
       </w:r>
     </w:p>
     <w:p>
@@ -12950,7 +14266,7 @@
           <w:b w:val="0"/>
           <w:sz w:val="18"/>
         </w:rPr>
-        <w:t>Bearer JWT</w:t>
+        <w:t>Bearer {{riderJwt}} — RIDER role</w:t>
       </w:r>
       <w:r>
         <w:rPr>
@@ -12967,7 +14283,7 @@
           <w:b w:val="0"/>
           <w:sz w:val="18"/>
         </w:rPr>
-        <w:t>No body</w:t>
+        <w:t>Query parameters</w:t>
       </w:r>
     </w:p>
     <w:p>
@@ -12998,7 +14314,7 @@
           <w:color w:val="1F4D78"/>
           <w:sz w:val="16"/>
         </w:rPr>
-        <w:t>GET {{baseUrl}}/rider/{{riderId}}/history</w:t>
+        <w:t>POST {{baseUrl}}/ride/accept?rideId={{rideId}}&amp;riderId={{riderId}}</w:t>
       </w:r>
     </w:p>
     <w:p>
@@ -13037,75 +14353,58 @@
           <w:b w:val="0"/>
           <w:sz w:val="18"/>
         </w:rPr>
-        <w:t>200 OK with an array of rides whose RIDER_ID equals the path value, newest ride ID first.</w:t>
+        <w:t>200 OK: Ride accepted</w:t>
+      </w:r>
+    </w:p>
+    <w:p>
+      <w:pPr>
+        <w:spacing w:before="0" w:after="120" w:line="283" w:lineRule="auto"/>
+      </w:pPr>
+      <w:r>
+        <w:rPr>
+          <w:rFonts w:ascii="Calibri" w:hAnsi="Calibri"/>
+          <w:b/>
+          <w:color w:val="9C6500"/>
+          <w:sz w:val="18"/>
+        </w:rPr>
+        <w:t xml:space="preserve">Note: </w:t>
+      </w:r>
+      <w:r>
+        <w:rPr>
+          <w:rFonts w:ascii="Calibri" w:hAnsi="Calibri"/>
+          <w:b w:val="0"/>
+          <w:color w:val="9C6500"/>
+          <w:sz w:val="18"/>
+        </w:rPr>
+        <w:t>The submitted riderId must match the authenticated rider's JWT-linked RIDER_DETAILS profile. The rider must be AVAILABLE, have no ACCEPTED or STARTED ride, and have a SENT RIDE_REQUEST row for this ride. This prevents rider-ID impersonation and accepting a guessed or already-assigned ride. The first valid accept wins atomically; the winner becomes ON_TRIP and other RIDE_REQUEST rows are CANCELLED.</w:t>
       </w:r>
     </w:p>
     <w:p>
       <w:pPr>
         <w:keepNext/>
-        <w:spacing w:before="160" w:after="100"/>
+        <w:spacing w:before="220" w:after="100"/>
       </w:pPr>
       <w:r>
         <w:rPr>
           <w:rFonts w:ascii="Calibri" w:hAnsi="Calibri"/>
           <w:b/>
-          <w:color w:val="1F4D78"/>
-          <w:sz w:val="23"/>
-        </w:rPr>
-        <w:t>POST /rider/save/location</w:t>
-      </w:r>
-    </w:p>
-    <w:p>
-      <w:pPr>
-        <w:spacing w:before="0" w:after="60" w:line="283" w:lineRule="auto"/>
-      </w:pPr>
-      <w:r>
-        <w:rPr>
-          <w:rFonts w:ascii="Calibri" w:hAnsi="Calibri"/>
-          <w:b/>
-          <w:color w:val="1F4D78"/>
-          <w:sz w:val="18"/>
-        </w:rPr>
-        <w:t xml:space="preserve">Authentication: </w:t>
-      </w:r>
-      <w:r>
-        <w:rPr>
-          <w:rFonts w:ascii="Calibri" w:hAnsi="Calibri"/>
-          <w:b w:val="0"/>
-          <w:sz w:val="18"/>
-        </w:rPr>
-        <w:t>Bearer {{riderJwt}} — RIDER role</w:t>
-      </w:r>
-      <w:r>
-        <w:rPr>
-          <w:rFonts w:ascii="Calibri" w:hAnsi="Calibri"/>
-          <w:b/>
-          <w:color w:val="1F4D78"/>
-          <w:sz w:val="18"/>
-        </w:rPr>
-        <w:t xml:space="preserve">   |   Request type: </w:t>
-      </w:r>
-      <w:r>
-        <w:rPr>
-          <w:rFonts w:ascii="Calibri" w:hAnsi="Calibri"/>
-          <w:b w:val="0"/>
-          <w:sz w:val="18"/>
-        </w:rPr>
-        <w:t>raw JSON</w:t>
-      </w:r>
-    </w:p>
-    <w:p>
-      <w:pPr>
-        <w:spacing w:before="0" w:after="40" w:line="283" w:lineRule="auto"/>
-      </w:pPr>
-      <w:r>
-        <w:rPr>
-          <w:rFonts w:ascii="Calibri" w:hAnsi="Calibri"/>
-          <w:b/>
-          <w:color w:val="1F4D78"/>
-          <w:sz w:val="18"/>
-        </w:rPr>
-        <w:t>Postman test</w:t>
+          <w:color w:val="2E74B5"/>
+          <w:sz w:val="26"/>
+        </w:rPr>
+        <w:t>Multiple rider requests and first-accept behavior</w:t>
+      </w:r>
+    </w:p>
+    <w:p>
+      <w:pPr>
+        <w:spacing w:before="0" w:after="80" w:line="283" w:lineRule="auto"/>
+      </w:pPr>
+      <w:r>
+        <w:rPr>
+          <w:rFonts w:ascii="Calibri" w:hAnsi="Calibri"/>
+          <w:b w:val="0"/>
+          <w:sz w:val="20"/>
+        </w:rPr>
+        <w:t>One ride can be sent to several eligible riders. The server creates one RIDE_REQUEST row for each rider, all with the same rideId and status SENT.</w:t>
       </w:r>
     </w:p>
     <w:p>
@@ -13122,7 +14421,7 @@
           <w:color w:val="1F4D78"/>
           <w:sz w:val="16"/>
         </w:rPr>
-        <w:t>POST {{baseUrl}}/rider/save/location</w:t>
+        <w:t>Before any acceptance</w:t>
       </w:r>
     </w:p>
     <w:p>
@@ -13139,7 +14438,7 @@
           <w:color w:val="1F4D78"/>
           <w:sz w:val="16"/>
         </w:rPr>
-        <w:t>Authorization: Bearer {{riderJwt}}</w:t>
+        <w:t>ride_id | rider_id | status</w:t>
       </w:r>
     </w:p>
     <w:p>
@@ -13156,7 +14455,7 @@
           <w:color w:val="1F4D78"/>
           <w:sz w:val="16"/>
         </w:rPr>
-        <w:t>Content-Type: application/json</w:t>
+        <w:t>42      | 3        | SENT</w:t>
       </w:r>
     </w:p>
     <w:p>
@@ -13173,7 +14472,7 @@
           <w:color w:val="1F4D78"/>
           <w:sz w:val="16"/>
         </w:rPr>
-        <w:t xml:space="preserve"> </w:t>
+        <w:t>42      | 7        | SENT</w:t>
       </w:r>
     </w:p>
     <w:p>
@@ -13190,7 +14489,7 @@
           <w:color w:val="1F4D78"/>
           <w:sz w:val="16"/>
         </w:rPr>
-        <w:t>{</w:t>
+        <w:t>42      | 12       | SENT</w:t>
       </w:r>
     </w:p>
     <w:p>
@@ -13207,7 +14506,7 @@
           <w:color w:val="1F4D78"/>
           <w:sz w:val="16"/>
         </w:rPr>
-        <w:t xml:space="preserve">  "latitude": 19.0770,</w:t>
+        <w:t xml:space="preserve"> </w:t>
       </w:r>
     </w:p>
     <w:p>
@@ -13224,7 +14523,126 @@
           <w:color w:val="1F4D78"/>
           <w:sz w:val="16"/>
         </w:rPr>
-        <w:t xml:space="preserve">  "longitude": 72.8777</w:t>
+        <w:t>After rider 7 accepts first</w:t>
+      </w:r>
+    </w:p>
+    <w:p>
+      <w:pPr>
+        <w:keepLines/>
+        <w:spacing w:after="0" w:line="240" w:lineRule="auto"/>
+        <w:ind w:left="230" w:right="115"/>
+        <w:shd w:fill="F5F8FC"/>
+      </w:pPr>
+      <w:r>
+        <w:rPr>
+          <w:rFonts w:ascii="Consolas" w:hAnsi="Consolas"/>
+          <w:b w:val="0"/>
+          <w:color w:val="1F4D78"/>
+          <w:sz w:val="16"/>
+        </w:rPr>
+        <w:t>ride_id | rider_id | status</w:t>
+      </w:r>
+    </w:p>
+    <w:p>
+      <w:pPr>
+        <w:keepLines/>
+        <w:spacing w:after="0" w:line="240" w:lineRule="auto"/>
+        <w:ind w:left="230" w:right="115"/>
+        <w:shd w:fill="F5F8FC"/>
+      </w:pPr>
+      <w:r>
+        <w:rPr>
+          <w:rFonts w:ascii="Consolas" w:hAnsi="Consolas"/>
+          <w:b w:val="0"/>
+          <w:color w:val="1F4D78"/>
+          <w:sz w:val="16"/>
+        </w:rPr>
+        <w:t>42      | 3        | CANCELLED</w:t>
+      </w:r>
+    </w:p>
+    <w:p>
+      <w:pPr>
+        <w:keepLines/>
+        <w:spacing w:after="0" w:line="240" w:lineRule="auto"/>
+        <w:ind w:left="230" w:right="115"/>
+        <w:shd w:fill="F5F8FC"/>
+      </w:pPr>
+      <w:r>
+        <w:rPr>
+          <w:rFonts w:ascii="Consolas" w:hAnsi="Consolas"/>
+          <w:b w:val="0"/>
+          <w:color w:val="1F4D78"/>
+          <w:sz w:val="16"/>
+        </w:rPr>
+        <w:t>42      | 7        | ACCEPTED</w:t>
+      </w:r>
+    </w:p>
+    <w:p>
+      <w:pPr>
+        <w:keepLines/>
+        <w:spacing w:after="0" w:line="240" w:lineRule="auto"/>
+        <w:ind w:left="230" w:right="115"/>
+        <w:shd w:fill="F5F8FC"/>
+      </w:pPr>
+      <w:r>
+        <w:rPr>
+          <w:rFonts w:ascii="Consolas" w:hAnsi="Consolas"/>
+          <w:b w:val="0"/>
+          <w:color w:val="1F4D78"/>
+          <w:sz w:val="16"/>
+        </w:rPr>
+        <w:t>42      | 12       | CANCELLED</w:t>
+      </w:r>
+    </w:p>
+    <w:p>
+      <w:pPr>
+        <w:keepLines/>
+        <w:spacing w:after="0" w:line="240" w:lineRule="auto"/>
+        <w:ind w:left="230" w:right="115"/>
+        <w:shd w:fill="F5F8FC"/>
+      </w:pPr>
+      <w:r>
+        <w:rPr>
+          <w:rFonts w:ascii="Consolas" w:hAnsi="Consolas"/>
+          <w:b w:val="0"/>
+          <w:color w:val="1F4D78"/>
+          <w:sz w:val="16"/>
+        </w:rPr>
+        <w:t xml:space="preserve"> </w:t>
+      </w:r>
+    </w:p>
+    <w:p>
+      <w:pPr>
+        <w:keepLines/>
+        <w:spacing w:after="0" w:line="240" w:lineRule="auto"/>
+        <w:ind w:left="230" w:right="115"/>
+        <w:shd w:fill="F5F8FC"/>
+      </w:pPr>
+      <w:r>
+        <w:rPr>
+          <w:rFonts w:ascii="Consolas" w:hAnsi="Consolas"/>
+          <w:b w:val="0"/>
+          <w:color w:val="1F4D78"/>
+          <w:sz w:val="16"/>
+        </w:rPr>
+        <w:t>RIDE_DETAILS for ride 42</w:t>
+      </w:r>
+    </w:p>
+    <w:p>
+      <w:pPr>
+        <w:keepLines/>
+        <w:spacing w:after="0" w:line="240" w:lineRule="auto"/>
+        <w:ind w:left="230" w:right="115"/>
+        <w:shd w:fill="F5F8FC"/>
+      </w:pPr>
+      <w:r>
+        <w:rPr>
+          <w:rFonts w:ascii="Consolas" w:hAnsi="Consolas"/>
+          <w:b w:val="0"/>
+          <w:color w:val="1F4D78"/>
+          <w:sz w:val="16"/>
+        </w:rPr>
+        <w:t>RIDER_ID = 7</w:t>
       </w:r>
     </w:p>
     <w:p>
@@ -13241,118 +14659,12 @@
           <w:color w:val="1F4D78"/>
           <w:sz w:val="16"/>
         </w:rPr>
-        <w:t>}</w:t>
-      </w:r>
-    </w:p>
-    <w:p>
-      <w:pPr>
-        <w:spacing w:before="0" w:after="0" w:line="283" w:lineRule="auto"/>
-      </w:pPr>
-      <w:r>
-        <w:rPr>
-          <w:rFonts w:ascii="Calibri" w:hAnsi="Calibri"/>
-          <w:b/>
-          <w:color w:val="1F4D78"/>
-          <w:sz w:val="18"/>
-        </w:rPr>
-        <w:t xml:space="preserve">Expected result: </w:t>
-      </w:r>
-      <w:r>
-        <w:rPr>
-          <w:rFonts w:ascii="Calibri" w:hAnsi="Calibri"/>
-          <w:b w:val="0"/>
-          <w:sz w:val="18"/>
-        </w:rPr>
-        <w:t>200 OK</w:t>
-      </w:r>
-    </w:p>
-    <w:p>
-      <w:pPr>
-        <w:keepLines/>
-        <w:spacing w:before="0" w:after="0" w:line="283" w:lineRule="auto"/>
-      </w:pPr>
-      <w:r>
-        <w:rPr>
-          <w:rFonts w:ascii="Calibri" w:hAnsi="Calibri"/>
-          <w:b w:val="0"/>
-          <w:sz w:val="18"/>
-        </w:rPr>
-        <w:t>{</w:t>
-      </w:r>
-    </w:p>
-    <w:p>
-      <w:pPr>
-        <w:keepLines/>
-        <w:spacing w:before="0" w:after="0" w:line="283" w:lineRule="auto"/>
-      </w:pPr>
-      <w:r>
-        <w:rPr>
-          <w:rFonts w:ascii="Calibri" w:hAnsi="Calibri"/>
-          <w:b w:val="0"/>
-          <w:sz w:val="18"/>
-        </w:rPr>
-        <w:t xml:space="preserve">  "type":"RIDER_LOCATION_SAVED",</w:t>
-      </w:r>
-    </w:p>
-    <w:p>
-      <w:pPr>
-        <w:keepLines/>
-        <w:spacing w:before="0" w:after="0" w:line="283" w:lineRule="auto"/>
-      </w:pPr>
-      <w:r>
-        <w:rPr>
-          <w:rFonts w:ascii="Calibri" w:hAnsi="Calibri"/>
-          <w:b w:val="0"/>
-          <w:sz w:val="18"/>
-        </w:rPr>
-        <w:t xml:space="preserve">  "riderId":3,</w:t>
-      </w:r>
-    </w:p>
-    <w:p>
-      <w:pPr>
-        <w:keepLines/>
-        <w:spacing w:before="0" w:after="0" w:line="283" w:lineRule="auto"/>
-      </w:pPr>
-      <w:r>
-        <w:rPr>
-          <w:rFonts w:ascii="Calibri" w:hAnsi="Calibri"/>
-          <w:b w:val="0"/>
-          <w:sz w:val="18"/>
-        </w:rPr>
-        <w:t xml:space="preserve">  "latitude":19.077,</w:t>
-      </w:r>
-    </w:p>
-    <w:p>
-      <w:pPr>
-        <w:keepLines/>
-        <w:spacing w:before="0" w:after="0" w:line="283" w:lineRule="auto"/>
-      </w:pPr>
-      <w:r>
-        <w:rPr>
-          <w:rFonts w:ascii="Calibri" w:hAnsi="Calibri"/>
-          <w:b w:val="0"/>
-          <w:sz w:val="18"/>
-        </w:rPr>
-        <w:t xml:space="preserve">  "longitude":72.8777</w:t>
-      </w:r>
-    </w:p>
-    <w:p>
-      <w:pPr>
-        <w:keepLines/>
-        <w:spacing w:before="0" w:after="100" w:line="283" w:lineRule="auto"/>
-      </w:pPr>
-      <w:r>
-        <w:rPr>
-          <w:rFonts w:ascii="Calibri" w:hAnsi="Calibri"/>
-          <w:b w:val="0"/>
-          <w:sz w:val="18"/>
-        </w:rPr>
-        <w:t>}</w:t>
-      </w:r>
-    </w:p>
-    <w:p>
-      <w:pPr>
-        <w:spacing w:before="0" w:after="120" w:line="283" w:lineRule="auto"/>
+        <w:t>RIDE_STATUS = ACCEPTED</w:t>
+      </w:r>
+    </w:p>
+    <w:p>
+      <w:pPr>
+        <w:spacing w:before="0" w:after="140" w:line="283" w:lineRule="auto"/>
       </w:pPr>
       <w:r>
         <w:rPr>
@@ -13361,7 +14673,7 @@
           <w:color w:val="9C6500"/>
           <w:sz w:val="18"/>
         </w:rPr>
-        <w:t xml:space="preserve">Note: </w:t>
+        <w:t xml:space="preserve">Important: </w:t>
       </w:r>
       <w:r>
         <w:rPr>
@@ -13370,75 +14682,35 @@
           <w:color w:val="9C6500"/>
           <w:sz w:val="18"/>
         </w:rPr>
-        <w:t>No rideId or riderId is sent. The server derives riderId from the JWT → USERS → RIDER_DETAILS.USER_ID mapping, then atomically upserts the current rider location. This endpoint works before a ride is assigned.</w:t>
+        <w:t>The cancellation of other candidate rows is automatic. Riders 3 and 12 also receive a RIDE_CANCELLED WebSocket event at /topic/rider/{riderId}, so their apps can remove that request immediately.</w:t>
       </w:r>
     </w:p>
     <w:p>
       <w:pPr>
         <w:keepNext/>
-        <w:spacing w:before="160" w:after="100"/>
+        <w:spacing w:before="220" w:after="100"/>
       </w:pPr>
       <w:r>
         <w:rPr>
           <w:rFonts w:ascii="Calibri" w:hAnsi="Calibri"/>
           <w:b/>
-          <w:color w:val="1F4D78"/>
-          <w:sz w:val="23"/>
-        </w:rPr>
-        <w:t>GET /rider/nearby</w:t>
-      </w:r>
-    </w:p>
-    <w:p>
-      <w:pPr>
-        <w:spacing w:before="0" w:after="60" w:line="283" w:lineRule="auto"/>
-      </w:pPr>
-      <w:r>
-        <w:rPr>
-          <w:rFonts w:ascii="Calibri" w:hAnsi="Calibri"/>
-          <w:b/>
-          <w:color w:val="1F4D78"/>
-          <w:sz w:val="18"/>
-        </w:rPr>
-        <w:t xml:space="preserve">Authentication: </w:t>
-      </w:r>
-      <w:r>
-        <w:rPr>
-          <w:rFonts w:ascii="Calibri" w:hAnsi="Calibri"/>
-          <w:b w:val="0"/>
-          <w:sz w:val="18"/>
-        </w:rPr>
-        <w:t>Bearer JWT</w:t>
-      </w:r>
-      <w:r>
-        <w:rPr>
-          <w:rFonts w:ascii="Calibri" w:hAnsi="Calibri"/>
-          <w:b/>
-          <w:color w:val="1F4D78"/>
-          <w:sz w:val="18"/>
-        </w:rPr>
-        <w:t xml:space="preserve">   |   Request type: </w:t>
-      </w:r>
-      <w:r>
-        <w:rPr>
-          <w:rFonts w:ascii="Calibri" w:hAnsi="Calibri"/>
-          <w:b w:val="0"/>
-          <w:sz w:val="18"/>
-        </w:rPr>
-        <w:t>Query parameters</w:t>
-      </w:r>
-    </w:p>
-    <w:p>
-      <w:pPr>
-        <w:spacing w:before="0" w:after="40" w:line="283" w:lineRule="auto"/>
-      </w:pPr>
-      <w:r>
-        <w:rPr>
-          <w:rFonts w:ascii="Calibri" w:hAnsi="Calibri"/>
-          <w:b/>
-          <w:color w:val="1F4D78"/>
-          <w:sz w:val="18"/>
-        </w:rPr>
-        <w:t>Postman test</w:t>
+          <w:color w:val="2E74B5"/>
+          <w:sz w:val="26"/>
+        </w:rPr>
+        <w:t>Private live-location WebSocket test</w:t>
+      </w:r>
+    </w:p>
+    <w:p>
+      <w:pPr>
+        <w:spacing w:before="0" w:after="100" w:line="283" w:lineRule="auto"/>
+      </w:pPr>
+      <w:r>
+        <w:rPr>
+          <w:rFonts w:ascii="Calibri" w:hAnsi="Calibri"/>
+          <w:b w:val="0"/>
+          <w:sz w:val="19"/>
+        </w:rPr>
+        <w:t>Connect CodePen/browser as the booking ADMIN whose username matches the ride's ADMIN_ID. For ride 2 in the current test database that user is ariyaan. The rider must be assigned to a ride with status ACCEPTED or STARTED.</w:t>
       </w:r>
     </w:p>
     <w:p>
@@ -13455,7 +14727,228 @@
           <w:color w:val="1F4D78"/>
           <w:sz w:val="16"/>
         </w:rPr>
-        <w:t>GET {{baseUrl}}/rider/nearby?lat=19.0760&amp;lon=72.8777</w:t>
+        <w:t>Browser STOMP CONNECT header</w:t>
+      </w:r>
+    </w:p>
+    <w:p>
+      <w:pPr>
+        <w:keepLines/>
+        <w:spacing w:after="0" w:line="240" w:lineRule="auto"/>
+        <w:ind w:left="230" w:right="115"/>
+        <w:shd w:fill="F5F8FC"/>
+      </w:pPr>
+      <w:r>
+        <w:rPr>
+          <w:rFonts w:ascii="Consolas" w:hAnsi="Consolas"/>
+          <w:b w:val="0"/>
+          <w:color w:val="1F4D78"/>
+          <w:sz w:val="16"/>
+        </w:rPr>
+        <w:t>Authorization: Bearer {{adminJwt}}</w:t>
+      </w:r>
+    </w:p>
+    <w:p>
+      <w:pPr>
+        <w:keepLines/>
+        <w:spacing w:after="0" w:line="240" w:lineRule="auto"/>
+        <w:ind w:left="230" w:right="115"/>
+        <w:shd w:fill="F5F8FC"/>
+      </w:pPr>
+      <w:r>
+        <w:rPr>
+          <w:rFonts w:ascii="Consolas" w:hAnsi="Consolas"/>
+          <w:b w:val="0"/>
+          <w:color w:val="1F4D78"/>
+          <w:sz w:val="16"/>
+        </w:rPr>
+        <w:t xml:space="preserve"> </w:t>
+      </w:r>
+    </w:p>
+    <w:p>
+      <w:pPr>
+        <w:keepLines/>
+        <w:spacing w:after="0" w:line="240" w:lineRule="auto"/>
+        <w:ind w:left="230" w:right="115"/>
+        <w:shd w:fill="F5F8FC"/>
+      </w:pPr>
+      <w:r>
+        <w:rPr>
+          <w:rFonts w:ascii="Consolas" w:hAnsi="Consolas"/>
+          <w:b w:val="0"/>
+          <w:color w:val="1F4D78"/>
+          <w:sz w:val="16"/>
+        </w:rPr>
+        <w:t>Private subscription</w:t>
+      </w:r>
+    </w:p>
+    <w:p>
+      <w:pPr>
+        <w:keepLines/>
+        <w:spacing w:after="0" w:line="240" w:lineRule="auto"/>
+        <w:ind w:left="230" w:right="115"/>
+        <w:shd w:fill="F5F8FC"/>
+      </w:pPr>
+      <w:r>
+        <w:rPr>
+          <w:rFonts w:ascii="Consolas" w:hAnsi="Consolas"/>
+          <w:b w:val="0"/>
+          <w:color w:val="1F4D78"/>
+          <w:sz w:val="16"/>
+        </w:rPr>
+        <w:t>/user/queue/ride/{{rideId}}/location</w:t>
+      </w:r>
+    </w:p>
+    <w:p>
+      <w:pPr>
+        <w:keepLines/>
+        <w:spacing w:after="0" w:line="240" w:lineRule="auto"/>
+        <w:ind w:left="230" w:right="115"/>
+        <w:shd w:fill="F5F8FC"/>
+      </w:pPr>
+      <w:r>
+        <w:rPr>
+          <w:rFonts w:ascii="Consolas" w:hAnsi="Consolas"/>
+          <w:b w:val="0"/>
+          <w:color w:val="1F4D78"/>
+          <w:sz w:val="16"/>
+        </w:rPr>
+        <w:t xml:space="preserve"> </w:t>
+      </w:r>
+    </w:p>
+    <w:p>
+      <w:pPr>
+        <w:keepLines/>
+        <w:spacing w:after="0" w:line="240" w:lineRule="auto"/>
+        <w:ind w:left="230" w:right="115"/>
+        <w:shd w:fill="F5F8FC"/>
+      </w:pPr>
+      <w:r>
+        <w:rPr>
+          <w:rFonts w:ascii="Consolas" w:hAnsi="Consolas"/>
+          <w:b w:val="0"/>
+          <w:color w:val="1F4D78"/>
+          <w:sz w:val="16"/>
+        </w:rPr>
+        <w:t>Rider HTTP update (after the browser subscription is connected)</w:t>
+      </w:r>
+    </w:p>
+    <w:p>
+      <w:pPr>
+        <w:keepLines/>
+        <w:spacing w:after="0" w:line="240" w:lineRule="auto"/>
+        <w:ind w:left="230" w:right="115"/>
+        <w:shd w:fill="F5F8FC"/>
+      </w:pPr>
+      <w:r>
+        <w:rPr>
+          <w:rFonts w:ascii="Consolas" w:hAnsi="Consolas"/>
+          <w:b w:val="0"/>
+          <w:color w:val="1F4D78"/>
+          <w:sz w:val="16"/>
+        </w:rPr>
+        <w:t>POST {{baseUrl}}/rider/fetch/livelocation</w:t>
+      </w:r>
+    </w:p>
+    <w:p>
+      <w:pPr>
+        <w:keepLines/>
+        <w:spacing w:after="0" w:line="240" w:lineRule="auto"/>
+        <w:ind w:left="230" w:right="115"/>
+        <w:shd w:fill="F5F8FC"/>
+      </w:pPr>
+      <w:r>
+        <w:rPr>
+          <w:rFonts w:ascii="Consolas" w:hAnsi="Consolas"/>
+          <w:b w:val="0"/>
+          <w:color w:val="1F4D78"/>
+          <w:sz w:val="16"/>
+        </w:rPr>
+        <w:t>Authorization: Bearer {{riderJwt}}</w:t>
+      </w:r>
+    </w:p>
+    <w:p>
+      <w:pPr>
+        <w:keepLines/>
+        <w:spacing w:after="0" w:line="240" w:lineRule="auto"/>
+        <w:ind w:left="230" w:right="115"/>
+        <w:shd w:fill="F5F8FC"/>
+      </w:pPr>
+      <w:r>
+        <w:rPr>
+          <w:rFonts w:ascii="Consolas" w:hAnsi="Consolas"/>
+          <w:b w:val="0"/>
+          <w:color w:val="1F4D78"/>
+          <w:sz w:val="16"/>
+        </w:rPr>
+        <w:t>Content-Type: application/json</w:t>
+      </w:r>
+    </w:p>
+    <w:p>
+      <w:pPr>
+        <w:keepLines/>
+        <w:spacing w:after="0" w:line="240" w:lineRule="auto"/>
+        <w:ind w:left="230" w:right="115"/>
+        <w:shd w:fill="F5F8FC"/>
+      </w:pPr>
+      <w:r>
+        <w:rPr>
+          <w:rFonts w:ascii="Consolas" w:hAnsi="Consolas"/>
+          <w:b w:val="0"/>
+          <w:color w:val="1F4D78"/>
+          <w:sz w:val="16"/>
+        </w:rPr>
+        <w:t xml:space="preserve"> </w:t>
+      </w:r>
+    </w:p>
+    <w:p>
+      <w:pPr>
+        <w:keepLines/>
+        <w:spacing w:after="0" w:line="240" w:lineRule="auto"/>
+        <w:ind w:left="230" w:right="115"/>
+        <w:shd w:fill="F5F8FC"/>
+      </w:pPr>
+      <w:r>
+        <w:rPr>
+          <w:rFonts w:ascii="Consolas" w:hAnsi="Consolas"/>
+          <w:b w:val="0"/>
+          <w:color w:val="1F4D78"/>
+          <w:sz w:val="16"/>
+        </w:rPr>
+        <w:t>{</w:t>
+      </w:r>
+    </w:p>
+    <w:p>
+      <w:pPr>
+        <w:keepLines/>
+        <w:spacing w:after="0" w:line="240" w:lineRule="auto"/>
+        <w:ind w:left="230" w:right="115"/>
+        <w:shd w:fill="F5F8FC"/>
+      </w:pPr>
+      <w:r>
+        <w:rPr>
+          <w:rFonts w:ascii="Consolas" w:hAnsi="Consolas"/>
+          <w:b w:val="0"/>
+          <w:color w:val="1F4D78"/>
+          <w:sz w:val="16"/>
+        </w:rPr>
+        <w:t xml:space="preserve">  "latitude": 19.0780,</w:t>
+      </w:r>
+    </w:p>
+    <w:p>
+      <w:pPr>
+        <w:keepLines/>
+        <w:spacing w:after="0" w:line="240" w:lineRule="auto"/>
+        <w:ind w:left="230" w:right="115"/>
+        <w:shd w:fill="F5F8FC"/>
+      </w:pPr>
+      <w:r>
+        <w:rPr>
+          <w:rFonts w:ascii="Consolas" w:hAnsi="Consolas"/>
+          <w:b w:val="0"/>
+          <w:color w:val="1F4D78"/>
+          <w:sz w:val="16"/>
+        </w:rPr>
+        <w:t xml:space="preserve">  "longitude": 72.8780</w:t>
       </w:r>
     </w:p>
     <w:p>
@@ -13472,135 +14965,21 @@
           <w:color w:val="1F4D78"/>
           <w:sz w:val="16"/>
         </w:rPr>
-        <w:t>Authorization: Bearer {{adminJwt}}</w:t>
-      </w:r>
-    </w:p>
-    <w:p>
-      <w:pPr>
-        <w:spacing w:before="0" w:after="100" w:line="283" w:lineRule="auto"/>
-      </w:pPr>
-      <w:r>
-        <w:rPr>
-          <w:rFonts w:ascii="Calibri" w:hAnsi="Calibri"/>
-          <w:b/>
-          <w:color w:val="1F4D78"/>
-          <w:sz w:val="18"/>
-        </w:rPr>
-        <w:t xml:space="preserve">Expected result: </w:t>
-      </w:r>
-      <w:r>
-        <w:rPr>
-          <w:rFonts w:ascii="Calibri" w:hAnsi="Calibri"/>
-          <w:b w:val="0"/>
-          <w:sz w:val="18"/>
-        </w:rPr>
-        <w:t>200 OK with a rider-ID array, for example [3].</w:t>
-      </w:r>
-    </w:p>
-    <w:p>
-      <w:pPr>
-        <w:spacing w:before="0" w:after="120" w:line="283" w:lineRule="auto"/>
-      </w:pPr>
-      <w:r>
-        <w:rPr>
-          <w:rFonts w:ascii="Calibri" w:hAnsi="Calibri"/>
-          <w:b/>
-          <w:color w:val="9C6500"/>
-          <w:sz w:val="18"/>
-        </w:rPr>
-        <w:t xml:space="preserve">Note: </w:t>
-      </w:r>
-      <w:r>
-        <w:rPr>
-          <w:rFonts w:ascii="Calibri" w:hAnsi="Calibri"/>
-          <w:b w:val="0"/>
-          <w:color w:val="9C6500"/>
-          <w:sz w:val="18"/>
-        </w:rPr>
-        <w:t>A rider is returned only when location is newer than 10 minutes, status is AVAILABLE, verification is true, and Haversine distance is &lt;= 10 km.</w:t>
-      </w:r>
-    </w:p>
-    <w:p>
-      <w:pPr>
-        <w:keepNext/>
-        <w:spacing w:before="320" w:after="140"/>
+        <w:t>}</w:t>
+      </w:r>
+    </w:p>
+    <w:p>
+      <w:pPr>
+        <w:spacing w:before="0" w:after="40" w:line="283" w:lineRule="auto"/>
       </w:pPr>
       <w:r>
         <w:rPr>
           <w:rFonts w:ascii="Calibri" w:hAnsi="Calibri"/>
           <w:b/>
           <w:color w:val="2E74B5"/>
-          <w:sz w:val="32"/>
-        </w:rPr>
-        <w:t>7. Ride request, acceptance, and live tracking</w:t>
-      </w:r>
-    </w:p>
-    <w:p>
-      <w:pPr>
-        <w:keepNext/>
-        <w:spacing w:before="160" w:after="100"/>
-      </w:pPr>
-      <w:r>
-        <w:rPr>
-          <w:rFonts w:ascii="Calibri" w:hAnsi="Calibri"/>
-          <w:b/>
-          <w:color w:val="1F4D78"/>
-          <w:sz w:val="23"/>
-        </w:rPr>
-        <w:t>POST /ride/request</w:t>
-      </w:r>
-    </w:p>
-    <w:p>
-      <w:pPr>
-        <w:spacing w:before="0" w:after="60" w:line="283" w:lineRule="auto"/>
-      </w:pPr>
-      <w:r>
-        <w:rPr>
-          <w:rFonts w:ascii="Calibri" w:hAnsi="Calibri"/>
-          <w:b/>
-          <w:color w:val="1F4D78"/>
           <w:sz w:val="18"/>
         </w:rPr>
-        <w:t xml:space="preserve">Authentication: </w:t>
-      </w:r>
-      <w:r>
-        <w:rPr>
-          <w:rFonts w:ascii="Calibri" w:hAnsi="Calibri"/>
-          <w:b w:val="0"/>
-          <w:sz w:val="18"/>
-        </w:rPr>
-        <w:t>Bearer {{adminJwt}} — ADMIN role</w:t>
-      </w:r>
-      <w:r>
-        <w:rPr>
-          <w:rFonts w:ascii="Calibri" w:hAnsi="Calibri"/>
-          <w:b/>
-          <w:color w:val="1F4D78"/>
-          <w:sz w:val="18"/>
-        </w:rPr>
-        <w:t xml:space="preserve">   |   Request type: </w:t>
-      </w:r>
-      <w:r>
-        <w:rPr>
-          <w:rFonts w:ascii="Calibri" w:hAnsi="Calibri"/>
-          <w:b w:val="0"/>
-          <w:sz w:val="18"/>
-        </w:rPr>
-        <w:t>raw JSON</w:t>
-      </w:r>
-    </w:p>
-    <w:p>
-      <w:pPr>
-        <w:spacing w:before="0" w:after="40" w:line="283" w:lineRule="auto"/>
-      </w:pPr>
-      <w:r>
-        <w:rPr>
-          <w:rFonts w:ascii="Calibri" w:hAnsi="Calibri"/>
-          <w:b/>
-          <w:color w:val="1F4D78"/>
-          <w:sz w:val="18"/>
-        </w:rPr>
-        <w:t>Postman test</w:t>
+        <w:t>Expected HTTP response</w:t>
       </w:r>
     </w:p>
     <w:p>
@@ -13617,7 +14996,7 @@
           <w:color w:val="1F4D78"/>
           <w:sz w:val="16"/>
         </w:rPr>
-        <w:t>POST {{baseUrl}}/ride/request</w:t>
+        <w:t>{</w:t>
       </w:r>
     </w:p>
     <w:p>
@@ -13634,7 +15013,7 @@
           <w:color w:val="1F4D78"/>
           <w:sz w:val="16"/>
         </w:rPr>
-        <w:t>Authorization: Bearer {{adminJwt}}</w:t>
+        <w:t xml:space="preserve">  "type":"RIDER_LOCATION_UPDATED",</w:t>
       </w:r>
     </w:p>
     <w:p>
@@ -13651,7 +15030,7 @@
           <w:color w:val="1F4D78"/>
           <w:sz w:val="16"/>
         </w:rPr>
-        <w:t>Content-Type: application/json</w:t>
+        <w:t xml:space="preserve">  "rideId":2,</w:t>
       </w:r>
     </w:p>
     <w:p>
@@ -13668,7 +15047,7 @@
           <w:color w:val="1F4D78"/>
           <w:sz w:val="16"/>
         </w:rPr>
-        <w:t xml:space="preserve"> </w:t>
+        <w:t xml:space="preserve">  "riderId":3,</w:t>
       </w:r>
     </w:p>
     <w:p>
@@ -13685,7 +15064,7 @@
           <w:color w:val="1F4D78"/>
           <w:sz w:val="16"/>
         </w:rPr>
-        <w:t>{</w:t>
+        <w:t xml:space="preserve">  "latitude":19.078,</w:t>
       </w:r>
     </w:p>
     <w:p>
@@ -13702,7 +15081,38 @@
           <w:color w:val="1F4D78"/>
           <w:sz w:val="16"/>
         </w:rPr>
-        <w:t xml:space="preserve">  "pickUpLatitude": 19.0760,</w:t>
+        <w:t xml:space="preserve">  "longitude":72.878</w:t>
+      </w:r>
+    </w:p>
+    <w:p>
+      <w:pPr>
+        <w:keepLines/>
+        <w:spacing w:after="60" w:line="240" w:lineRule="auto"/>
+        <w:ind w:left="230" w:right="115"/>
+        <w:shd w:fill="F5F8FC"/>
+      </w:pPr>
+      <w:r>
+        <w:rPr>
+          <w:rFonts w:ascii="Consolas" w:hAnsi="Consolas"/>
+          <w:b w:val="0"/>
+          <w:color w:val="1F4D78"/>
+          <w:sz w:val="16"/>
+        </w:rPr>
+        <w:t>}</w:t>
+      </w:r>
+    </w:p>
+    <w:p>
+      <w:pPr>
+        <w:spacing w:before="0" w:after="40" w:line="283" w:lineRule="auto"/>
+      </w:pPr>
+      <w:r>
+        <w:rPr>
+          <w:rFonts w:ascii="Calibri" w:hAnsi="Calibri"/>
+          <w:b/>
+          <w:color w:val="2E74B5"/>
+          <w:sz w:val="18"/>
+        </w:rPr>
+        <w:t>Expected private WebSocket message</w:t>
       </w:r>
     </w:p>
     <w:p>
@@ -13719,7 +15129,7 @@
           <w:color w:val="1F4D78"/>
           <w:sz w:val="16"/>
         </w:rPr>
-        <w:t xml:space="preserve">  "pickUpLongitude": 72.8777,</w:t>
+        <w:t>{</w:t>
       </w:r>
     </w:p>
     <w:p>
@@ -13736,7 +15146,7 @@
           <w:color w:val="1F4D78"/>
           <w:sz w:val="16"/>
         </w:rPr>
-        <w:t xml:space="preserve">  "dropLatitude": 19.1100,</w:t>
+        <w:t xml:space="preserve">  "type":"RIDER_LOCATION_UPDATED",</w:t>
       </w:r>
     </w:p>
     <w:p>
@@ -13753,7 +15163,7 @@
           <w:color w:val="1F4D78"/>
           <w:sz w:val="16"/>
         </w:rPr>
-        <w:t xml:space="preserve">  "dropLongitude": 72.9000,</w:t>
+        <w:t xml:space="preserve">  "rideId":2,</w:t>
       </w:r>
     </w:p>
     <w:p>
@@ -13770,7 +15180,7 @@
           <w:color w:val="1F4D78"/>
           <w:sz w:val="16"/>
         </w:rPr>
-        <w:t xml:space="preserve">  "fare": 125.00,</w:t>
+        <w:t xml:space="preserve">  "riderId":3,</w:t>
       </w:r>
     </w:p>
     <w:p>
@@ -13787,7 +15197,7 @@
           <w:color w:val="1F4D78"/>
           <w:sz w:val="16"/>
         </w:rPr>
-        <w:t xml:space="preserve">  "chassisNo": "MBLHA10A1NHB12345",</w:t>
+        <w:t xml:space="preserve">  "latitude":19.078,</w:t>
       </w:r>
     </w:p>
     <w:p>
@@ -13804,7 +15214,115 @@
           <w:color w:val="1F4D78"/>
           <w:sz w:val="16"/>
         </w:rPr>
-        <w:t xml:space="preserve">  "vehicleName": "Honda Activa 6G",</w:t>
+        <w:t xml:space="preserve">  "longitude":72.878</w:t>
+      </w:r>
+    </w:p>
+    <w:p>
+      <w:pPr>
+        <w:keepLines/>
+        <w:spacing w:after="60" w:line="240" w:lineRule="auto"/>
+        <w:ind w:left="230" w:right="115"/>
+        <w:shd w:fill="F5F8FC"/>
+      </w:pPr>
+      <w:r>
+        <w:rPr>
+          <w:rFonts w:ascii="Consolas" w:hAnsi="Consolas"/>
+          <w:b w:val="0"/>
+          <w:color w:val="1F4D78"/>
+          <w:sz w:val="16"/>
+        </w:rPr>
+        <w:t>}</w:t>
+      </w:r>
+    </w:p>
+    <w:p>
+      <w:pPr>
+        <w:spacing w:before="0" w:after="140" w:line="283" w:lineRule="auto"/>
+      </w:pPr>
+      <w:r>
+        <w:rPr>
+          <w:rFonts w:ascii="Calibri" w:hAnsi="Calibri"/>
+          <w:b/>
+          <w:color w:val="9C6500"/>
+          <w:sz w:val="18"/>
+        </w:rPr>
+        <w:t xml:space="preserve">Important: </w:t>
+      </w:r>
+      <w:r>
+        <w:rPr>
+          <w:rFonts w:ascii="Calibri" w:hAnsi="Calibri"/>
+          <w:b w:val="0"/>
+          <w:color w:val="9C6500"/>
+          <w:sz w:val="18"/>
+        </w:rPr>
+        <w:t>Do not subscribe to /topic/ride/{rideId} for live GPS updates. The current live-location event is private and goes to /user/queue/ride/{rideId}/location only. A rider JWT cannot receive the booking admin's private queue.</w:t>
+      </w:r>
+    </w:p>
+    <w:p>
+      <w:pPr>
+        <w:keepNext/>
+        <w:spacing w:before="160" w:after="100"/>
+      </w:pPr>
+      <w:r>
+        <w:rPr>
+          <w:rFonts w:ascii="Calibri" w:hAnsi="Calibri"/>
+          <w:b/>
+          <w:color w:val="1F4D78"/>
+          <w:sz w:val="23"/>
+        </w:rPr>
+        <w:t>POST /rider/fetch/livelocation</w:t>
+      </w:r>
+    </w:p>
+    <w:p>
+      <w:pPr>
+        <w:spacing w:before="0" w:after="60" w:line="283" w:lineRule="auto"/>
+      </w:pPr>
+      <w:r>
+        <w:rPr>
+          <w:rFonts w:ascii="Calibri" w:hAnsi="Calibri"/>
+          <w:b/>
+          <w:color w:val="1F4D78"/>
+          <w:sz w:val="18"/>
+        </w:rPr>
+        <w:t xml:space="preserve">Authentication: </w:t>
+      </w:r>
+      <w:r>
+        <w:rPr>
+          <w:rFonts w:ascii="Calibri" w:hAnsi="Calibri"/>
+          <w:b w:val="0"/>
+          <w:sz w:val="18"/>
+        </w:rPr>
+        <w:t>Bearer {{riderJwt}} — RIDER role</w:t>
+      </w:r>
+      <w:r>
+        <w:rPr>
+          <w:rFonts w:ascii="Calibri" w:hAnsi="Calibri"/>
+          <w:b/>
+          <w:color w:val="1F4D78"/>
+          <w:sz w:val="18"/>
+        </w:rPr>
+        <w:t xml:space="preserve">   |   Request type: </w:t>
+      </w:r>
+      <w:r>
+        <w:rPr>
+          <w:rFonts w:ascii="Calibri" w:hAnsi="Calibri"/>
+          <w:b w:val="0"/>
+          <w:sz w:val="18"/>
+        </w:rPr>
+        <w:t>raw JSON</w:t>
+      </w:r>
+    </w:p>
+    <w:p>
+      <w:pPr>
+        <w:spacing w:before="0" w:after="40" w:line="283" w:lineRule="auto"/>
+      </w:pPr>
+      <w:r>
+        <w:rPr>
+          <w:rFonts w:ascii="Calibri" w:hAnsi="Calibri"/>
+          <w:b/>
+          <w:color w:val="1F4D78"/>
+          <w:sz w:val="18"/>
+        </w:rPr>
+        <w:t>Postman test</w:t>
       </w:r>
     </w:p>
     <w:p>
@@ -13821,7 +15339,109 @@
           <w:color w:val="1F4D78"/>
           <w:sz w:val="16"/>
         </w:rPr>
-        <w:t xml:space="preserve">  "adminId": {{adminId}}</w:t>
+        <w:t>POST {{baseUrl}}/rider/fetch/livelocation</w:t>
+      </w:r>
+    </w:p>
+    <w:p>
+      <w:pPr>
+        <w:keepLines/>
+        <w:spacing w:after="0" w:line="240" w:lineRule="auto"/>
+        <w:ind w:left="230" w:right="115"/>
+        <w:shd w:fill="F5F8FC"/>
+      </w:pPr>
+      <w:r>
+        <w:rPr>
+          <w:rFonts w:ascii="Consolas" w:hAnsi="Consolas"/>
+          <w:b w:val="0"/>
+          <w:color w:val="1F4D78"/>
+          <w:sz w:val="16"/>
+        </w:rPr>
+        <w:t>Authorization: Bearer {{riderJwt}}</w:t>
+      </w:r>
+    </w:p>
+    <w:p>
+      <w:pPr>
+        <w:keepLines/>
+        <w:spacing w:after="0" w:line="240" w:lineRule="auto"/>
+        <w:ind w:left="230" w:right="115"/>
+        <w:shd w:fill="F5F8FC"/>
+      </w:pPr>
+      <w:r>
+        <w:rPr>
+          <w:rFonts w:ascii="Consolas" w:hAnsi="Consolas"/>
+          <w:b w:val="0"/>
+          <w:color w:val="1F4D78"/>
+          <w:sz w:val="16"/>
+        </w:rPr>
+        <w:t>Content-Type: application/json</w:t>
+      </w:r>
+    </w:p>
+    <w:p>
+      <w:pPr>
+        <w:keepLines/>
+        <w:spacing w:after="0" w:line="240" w:lineRule="auto"/>
+        <w:ind w:left="230" w:right="115"/>
+        <w:shd w:fill="F5F8FC"/>
+      </w:pPr>
+      <w:r>
+        <w:rPr>
+          <w:rFonts w:ascii="Consolas" w:hAnsi="Consolas"/>
+          <w:b w:val="0"/>
+          <w:color w:val="1F4D78"/>
+          <w:sz w:val="16"/>
+        </w:rPr>
+        <w:t xml:space="preserve"> </w:t>
+      </w:r>
+    </w:p>
+    <w:p>
+      <w:pPr>
+        <w:keepLines/>
+        <w:spacing w:after="0" w:line="240" w:lineRule="auto"/>
+        <w:ind w:left="230" w:right="115"/>
+        <w:shd w:fill="F5F8FC"/>
+      </w:pPr>
+      <w:r>
+        <w:rPr>
+          <w:rFonts w:ascii="Consolas" w:hAnsi="Consolas"/>
+          <w:b w:val="0"/>
+          <w:color w:val="1F4D78"/>
+          <w:sz w:val="16"/>
+        </w:rPr>
+        <w:t>{</w:t>
+      </w:r>
+    </w:p>
+    <w:p>
+      <w:pPr>
+        <w:keepLines/>
+        <w:spacing w:after="0" w:line="240" w:lineRule="auto"/>
+        <w:ind w:left="230" w:right="115"/>
+        <w:shd w:fill="F5F8FC"/>
+      </w:pPr>
+      <w:r>
+        <w:rPr>
+          <w:rFonts w:ascii="Consolas" w:hAnsi="Consolas"/>
+          <w:b w:val="0"/>
+          <w:color w:val="1F4D78"/>
+          <w:sz w:val="16"/>
+        </w:rPr>
+        <w:t xml:space="preserve">  "latitude": 19.0780,</w:t>
+      </w:r>
+    </w:p>
+    <w:p>
+      <w:pPr>
+        <w:keepLines/>
+        <w:spacing w:after="0" w:line="240" w:lineRule="auto"/>
+        <w:ind w:left="230" w:right="115"/>
+        <w:shd w:fill="F5F8FC"/>
+      </w:pPr>
+      <w:r>
+        <w:rPr>
+          <w:rFonts w:ascii="Consolas" w:hAnsi="Consolas"/>
+          <w:b w:val="0"/>
+          <w:color w:val="1F4D78"/>
+          <w:sz w:val="16"/>
+        </w:rPr>
+        <w:t xml:space="preserve">  "longitude": 72.8780</w:t>
       </w:r>
     </w:p>
     <w:p>
@@ -13860,7 +15480,7 @@
           <w:b w:val="0"/>
           <w:sz w:val="18"/>
         </w:rPr>
-        <w:t>200 OK with plain text: Ride Request Sent, id=2</w:t>
+        <w:t>200 OK with RIDER_LOCATION_UPDATED including server-derived riderId and rideId.</w:t>
       </w:r>
     </w:p>
     <w:p>
@@ -13883,7 +15503,22 @@
           <w:color w:val="9C6500"/>
           <w:sz w:val="18"/>
         </w:rPr>
-        <w:t>chassisNo and vehicleName are required and stored on RIDE_DETAILS. Copy the returned number to {{rideId}}. The server creates a 4-digit ride OTP, sets status REQUESTED, finds eligible riders, saves RIDE_REQUEST rows, and publishes RIDE_REQUEST events. Do not send rideId, riderId, rideOtp, or rideStatus in the body.</w:t>
+        <w:t>The server uses JWT username → USERS record → RIDER_DETAILS.USER_ID → active ACCEPTED/STARTED ride. If no active ride exists it returns 403 No active ride is assigned to this rider.</w:t>
+      </w:r>
+    </w:p>
+    <w:p>
+      <w:pPr>
+        <w:keepNext/>
+        <w:spacing w:before="320" w:after="140"/>
+      </w:pPr>
+      <w:r>
+        <w:rPr>
+          <w:rFonts w:ascii="Calibri" w:hAnsi="Calibri"/>
+          <w:b/>
+          <w:color w:val="2E74B5"/>
+          <w:sz w:val="32"/>
+        </w:rPr>
+        <w:t>8. Ride completion, cancellation, and utility tests</w:t>
       </w:r>
     </w:p>
     <w:p>
@@ -13898,7 +15533,7 @@
           <w:color w:val="1F4D78"/>
           <w:sz w:val="23"/>
         </w:rPr>
-        <w:t>POST /ride/accept</w:t>
+        <w:t>POST /ride/verify-otp</w:t>
       </w:r>
     </w:p>
     <w:p>
@@ -13968,7 +15603,7 @@
           <w:color w:val="1F4D78"/>
           <w:sz w:val="16"/>
         </w:rPr>
-        <w:t>POST {{baseUrl}}/ride/accept?rideId={{rideId}}&amp;riderId={{riderId}}</w:t>
+        <w:t>POST {{baseUrl}}/ride/verify-otp?rideId={{rideId}}&amp;riderId={{riderId}}&amp;otp={{rideOtp}}</w:t>
       </w:r>
     </w:p>
     <w:p>
@@ -14007,7 +15642,7 @@
           <w:b w:val="0"/>
           <w:sz w:val="18"/>
         </w:rPr>
-        <w:t>200 OK: Ride accepted</w:t>
+        <w:t>200 OK: OTP Verified. Ride Started</w:t>
       </w:r>
     </w:p>
     <w:p>
@@ -14030,990 +15665,7 @@
           <w:color w:val="9C6500"/>
           <w:sz w:val="18"/>
         </w:rPr>
-        <w:t>The first successful accept wins atomically. The assigned ride status becomes ACCEPTED. Other RIDE_REQUEST rows are marked CANCELLED. Current implementation sends the OTP in a RIDE_ACCEPTED public-topic event.</w:t>
-      </w:r>
-    </w:p>
-    <w:p>
-      <w:pPr>
-        <w:keepNext/>
-        <w:spacing w:before="220" w:after="100"/>
-      </w:pPr>
-      <w:r>
-        <w:rPr>
-          <w:rFonts w:ascii="Calibri" w:hAnsi="Calibri"/>
-          <w:b/>
-          <w:color w:val="2E74B5"/>
-          <w:sz w:val="26"/>
-        </w:rPr>
-        <w:t>Private live-location WebSocket test</w:t>
-      </w:r>
-    </w:p>
-    <w:p>
-      <w:pPr>
-        <w:spacing w:before="0" w:after="100" w:line="283" w:lineRule="auto"/>
-      </w:pPr>
-      <w:r>
-        <w:rPr>
-          <w:rFonts w:ascii="Calibri" w:hAnsi="Calibri"/>
-          <w:b w:val="0"/>
-          <w:sz w:val="19"/>
-        </w:rPr>
-        <w:t>Connect CodePen/browser as the booking ADMIN whose username matches the ride's ADMIN_ID. For ride 2 in the current test database that user is ariyaan. The rider must be assigned to a ride with status ACCEPTED or STARTED.</w:t>
-      </w:r>
-    </w:p>
-    <w:p>
-      <w:pPr>
-        <w:keepLines/>
-        <w:spacing w:after="0" w:line="240" w:lineRule="auto"/>
-        <w:ind w:left="230" w:right="115"/>
-        <w:shd w:fill="F5F8FC"/>
-      </w:pPr>
-      <w:r>
-        <w:rPr>
-          <w:rFonts w:ascii="Consolas" w:hAnsi="Consolas"/>
-          <w:b w:val="0"/>
-          <w:color w:val="1F4D78"/>
-          <w:sz w:val="16"/>
-        </w:rPr>
-        <w:t>Browser STOMP CONNECT header</w:t>
-      </w:r>
-    </w:p>
-    <w:p>
-      <w:pPr>
-        <w:keepLines/>
-        <w:spacing w:after="0" w:line="240" w:lineRule="auto"/>
-        <w:ind w:left="230" w:right="115"/>
-        <w:shd w:fill="F5F8FC"/>
-      </w:pPr>
-      <w:r>
-        <w:rPr>
-          <w:rFonts w:ascii="Consolas" w:hAnsi="Consolas"/>
-          <w:b w:val="0"/>
-          <w:color w:val="1F4D78"/>
-          <w:sz w:val="16"/>
-        </w:rPr>
-        <w:t>Authorization: Bearer {{adminJwt}}</w:t>
-      </w:r>
-    </w:p>
-    <w:p>
-      <w:pPr>
-        <w:keepLines/>
-        <w:spacing w:after="0" w:line="240" w:lineRule="auto"/>
-        <w:ind w:left="230" w:right="115"/>
-        <w:shd w:fill="F5F8FC"/>
-      </w:pPr>
-      <w:r>
-        <w:rPr>
-          <w:rFonts w:ascii="Consolas" w:hAnsi="Consolas"/>
-          <w:b w:val="0"/>
-          <w:color w:val="1F4D78"/>
-          <w:sz w:val="16"/>
-        </w:rPr>
-        <w:t xml:space="preserve"> </w:t>
-      </w:r>
-    </w:p>
-    <w:p>
-      <w:pPr>
-        <w:keepLines/>
-        <w:spacing w:after="0" w:line="240" w:lineRule="auto"/>
-        <w:ind w:left="230" w:right="115"/>
-        <w:shd w:fill="F5F8FC"/>
-      </w:pPr>
-      <w:r>
-        <w:rPr>
-          <w:rFonts w:ascii="Consolas" w:hAnsi="Consolas"/>
-          <w:b w:val="0"/>
-          <w:color w:val="1F4D78"/>
-          <w:sz w:val="16"/>
-        </w:rPr>
-        <w:t>Private subscription</w:t>
-      </w:r>
-    </w:p>
-    <w:p>
-      <w:pPr>
-        <w:keepLines/>
-        <w:spacing w:after="0" w:line="240" w:lineRule="auto"/>
-        <w:ind w:left="230" w:right="115"/>
-        <w:shd w:fill="F5F8FC"/>
-      </w:pPr>
-      <w:r>
-        <w:rPr>
-          <w:rFonts w:ascii="Consolas" w:hAnsi="Consolas"/>
-          <w:b w:val="0"/>
-          <w:color w:val="1F4D78"/>
-          <w:sz w:val="16"/>
-        </w:rPr>
-        <w:t>/user/queue/ride/{{rideId}}/location</w:t>
-      </w:r>
-    </w:p>
-    <w:p>
-      <w:pPr>
-        <w:keepLines/>
-        <w:spacing w:after="0" w:line="240" w:lineRule="auto"/>
-        <w:ind w:left="230" w:right="115"/>
-        <w:shd w:fill="F5F8FC"/>
-      </w:pPr>
-      <w:r>
-        <w:rPr>
-          <w:rFonts w:ascii="Consolas" w:hAnsi="Consolas"/>
-          <w:b w:val="0"/>
-          <w:color w:val="1F4D78"/>
-          <w:sz w:val="16"/>
-        </w:rPr>
-        <w:t xml:space="preserve"> </w:t>
-      </w:r>
-    </w:p>
-    <w:p>
-      <w:pPr>
-        <w:keepLines/>
-        <w:spacing w:after="0" w:line="240" w:lineRule="auto"/>
-        <w:ind w:left="230" w:right="115"/>
-        <w:shd w:fill="F5F8FC"/>
-      </w:pPr>
-      <w:r>
-        <w:rPr>
-          <w:rFonts w:ascii="Consolas" w:hAnsi="Consolas"/>
-          <w:b w:val="0"/>
-          <w:color w:val="1F4D78"/>
-          <w:sz w:val="16"/>
-        </w:rPr>
-        <w:t>Rider HTTP update (after the browser subscription is connected)</w:t>
-      </w:r>
-    </w:p>
-    <w:p>
-      <w:pPr>
-        <w:keepLines/>
-        <w:spacing w:after="0" w:line="240" w:lineRule="auto"/>
-        <w:ind w:left="230" w:right="115"/>
-        <w:shd w:fill="F5F8FC"/>
-      </w:pPr>
-      <w:r>
-        <w:rPr>
-          <w:rFonts w:ascii="Consolas" w:hAnsi="Consolas"/>
-          <w:b w:val="0"/>
-          <w:color w:val="1F4D78"/>
-          <w:sz w:val="16"/>
-        </w:rPr>
-        <w:t>POST {{baseUrl}}/rider/fetch/livelocation</w:t>
-      </w:r>
-    </w:p>
-    <w:p>
-      <w:pPr>
-        <w:keepLines/>
-        <w:spacing w:after="0" w:line="240" w:lineRule="auto"/>
-        <w:ind w:left="230" w:right="115"/>
-        <w:shd w:fill="F5F8FC"/>
-      </w:pPr>
-      <w:r>
-        <w:rPr>
-          <w:rFonts w:ascii="Consolas" w:hAnsi="Consolas"/>
-          <w:b w:val="0"/>
-          <w:color w:val="1F4D78"/>
-          <w:sz w:val="16"/>
-        </w:rPr>
-        <w:t>Authorization: Bearer {{riderJwt}}</w:t>
-      </w:r>
-    </w:p>
-    <w:p>
-      <w:pPr>
-        <w:keepLines/>
-        <w:spacing w:after="0" w:line="240" w:lineRule="auto"/>
-        <w:ind w:left="230" w:right="115"/>
-        <w:shd w:fill="F5F8FC"/>
-      </w:pPr>
-      <w:r>
-        <w:rPr>
-          <w:rFonts w:ascii="Consolas" w:hAnsi="Consolas"/>
-          <w:b w:val="0"/>
-          <w:color w:val="1F4D78"/>
-          <w:sz w:val="16"/>
-        </w:rPr>
-        <w:t>Content-Type: application/json</w:t>
-      </w:r>
-    </w:p>
-    <w:p>
-      <w:pPr>
-        <w:keepLines/>
-        <w:spacing w:after="0" w:line="240" w:lineRule="auto"/>
-        <w:ind w:left="230" w:right="115"/>
-        <w:shd w:fill="F5F8FC"/>
-      </w:pPr>
-      <w:r>
-        <w:rPr>
-          <w:rFonts w:ascii="Consolas" w:hAnsi="Consolas"/>
-          <w:b w:val="0"/>
-          <w:color w:val="1F4D78"/>
-          <w:sz w:val="16"/>
-        </w:rPr>
-        <w:t xml:space="preserve"> </w:t>
-      </w:r>
-    </w:p>
-    <w:p>
-      <w:pPr>
-        <w:keepLines/>
-        <w:spacing w:after="0" w:line="240" w:lineRule="auto"/>
-        <w:ind w:left="230" w:right="115"/>
-        <w:shd w:fill="F5F8FC"/>
-      </w:pPr>
-      <w:r>
-        <w:rPr>
-          <w:rFonts w:ascii="Consolas" w:hAnsi="Consolas"/>
-          <w:b w:val="0"/>
-          <w:color w:val="1F4D78"/>
-          <w:sz w:val="16"/>
-        </w:rPr>
-        <w:t>{</w:t>
-      </w:r>
-    </w:p>
-    <w:p>
-      <w:pPr>
-        <w:keepLines/>
-        <w:spacing w:after="0" w:line="240" w:lineRule="auto"/>
-        <w:ind w:left="230" w:right="115"/>
-        <w:shd w:fill="F5F8FC"/>
-      </w:pPr>
-      <w:r>
-        <w:rPr>
-          <w:rFonts w:ascii="Consolas" w:hAnsi="Consolas"/>
-          <w:b w:val="0"/>
-          <w:color w:val="1F4D78"/>
-          <w:sz w:val="16"/>
-        </w:rPr>
-        <w:t xml:space="preserve">  "latitude": 19.0780,</w:t>
-      </w:r>
-    </w:p>
-    <w:p>
-      <w:pPr>
-        <w:keepLines/>
-        <w:spacing w:after="0" w:line="240" w:lineRule="auto"/>
-        <w:ind w:left="230" w:right="115"/>
-        <w:shd w:fill="F5F8FC"/>
-      </w:pPr>
-      <w:r>
-        <w:rPr>
-          <w:rFonts w:ascii="Consolas" w:hAnsi="Consolas"/>
-          <w:b w:val="0"/>
-          <w:color w:val="1F4D78"/>
-          <w:sz w:val="16"/>
-        </w:rPr>
-        <w:t xml:space="preserve">  "longitude": 72.8780</w:t>
-      </w:r>
-    </w:p>
-    <w:p>
-      <w:pPr>
-        <w:keepLines/>
-        <w:spacing w:after="60" w:line="240" w:lineRule="auto"/>
-        <w:ind w:left="230" w:right="115"/>
-        <w:shd w:fill="F5F8FC"/>
-      </w:pPr>
-      <w:r>
-        <w:rPr>
-          <w:rFonts w:ascii="Consolas" w:hAnsi="Consolas"/>
-          <w:b w:val="0"/>
-          <w:color w:val="1F4D78"/>
-          <w:sz w:val="16"/>
-        </w:rPr>
-        <w:t>}</w:t>
-      </w:r>
-    </w:p>
-    <w:p>
-      <w:pPr>
-        <w:spacing w:before="0" w:after="40" w:line="283" w:lineRule="auto"/>
-      </w:pPr>
-      <w:r>
-        <w:rPr>
-          <w:rFonts w:ascii="Calibri" w:hAnsi="Calibri"/>
-          <w:b/>
-          <w:color w:val="2E74B5"/>
-          <w:sz w:val="18"/>
-        </w:rPr>
-        <w:t>Expected HTTP response</w:t>
-      </w:r>
-    </w:p>
-    <w:p>
-      <w:pPr>
-        <w:keepLines/>
-        <w:spacing w:after="0" w:line="240" w:lineRule="auto"/>
-        <w:ind w:left="230" w:right="115"/>
-        <w:shd w:fill="F5F8FC"/>
-      </w:pPr>
-      <w:r>
-        <w:rPr>
-          <w:rFonts w:ascii="Consolas" w:hAnsi="Consolas"/>
-          <w:b w:val="0"/>
-          <w:color w:val="1F4D78"/>
-          <w:sz w:val="16"/>
-        </w:rPr>
-        <w:t>{</w:t>
-      </w:r>
-    </w:p>
-    <w:p>
-      <w:pPr>
-        <w:keepLines/>
-        <w:spacing w:after="0" w:line="240" w:lineRule="auto"/>
-        <w:ind w:left="230" w:right="115"/>
-        <w:shd w:fill="F5F8FC"/>
-      </w:pPr>
-      <w:r>
-        <w:rPr>
-          <w:rFonts w:ascii="Consolas" w:hAnsi="Consolas"/>
-          <w:b w:val="0"/>
-          <w:color w:val="1F4D78"/>
-          <w:sz w:val="16"/>
-        </w:rPr>
-        <w:t xml:space="preserve">  "type":"RIDER_LOCATION_UPDATED",</w:t>
-      </w:r>
-    </w:p>
-    <w:p>
-      <w:pPr>
-        <w:keepLines/>
-        <w:spacing w:after="0" w:line="240" w:lineRule="auto"/>
-        <w:ind w:left="230" w:right="115"/>
-        <w:shd w:fill="F5F8FC"/>
-      </w:pPr>
-      <w:r>
-        <w:rPr>
-          <w:rFonts w:ascii="Consolas" w:hAnsi="Consolas"/>
-          <w:b w:val="0"/>
-          <w:color w:val="1F4D78"/>
-          <w:sz w:val="16"/>
-        </w:rPr>
-        <w:t xml:space="preserve">  "rideId":2,</w:t>
-      </w:r>
-    </w:p>
-    <w:p>
-      <w:pPr>
-        <w:keepLines/>
-        <w:spacing w:after="0" w:line="240" w:lineRule="auto"/>
-        <w:ind w:left="230" w:right="115"/>
-        <w:shd w:fill="F5F8FC"/>
-      </w:pPr>
-      <w:r>
-        <w:rPr>
-          <w:rFonts w:ascii="Consolas" w:hAnsi="Consolas"/>
-          <w:b w:val="0"/>
-          <w:color w:val="1F4D78"/>
-          <w:sz w:val="16"/>
-        </w:rPr>
-        <w:t xml:space="preserve">  "riderId":3,</w:t>
-      </w:r>
-    </w:p>
-    <w:p>
-      <w:pPr>
-        <w:keepLines/>
-        <w:spacing w:after="0" w:line="240" w:lineRule="auto"/>
-        <w:ind w:left="230" w:right="115"/>
-        <w:shd w:fill="F5F8FC"/>
-      </w:pPr>
-      <w:r>
-        <w:rPr>
-          <w:rFonts w:ascii="Consolas" w:hAnsi="Consolas"/>
-          <w:b w:val="0"/>
-          <w:color w:val="1F4D78"/>
-          <w:sz w:val="16"/>
-        </w:rPr>
-        <w:t xml:space="preserve">  "latitude":19.078,</w:t>
-      </w:r>
-    </w:p>
-    <w:p>
-      <w:pPr>
-        <w:keepLines/>
-        <w:spacing w:after="0" w:line="240" w:lineRule="auto"/>
-        <w:ind w:left="230" w:right="115"/>
-        <w:shd w:fill="F5F8FC"/>
-      </w:pPr>
-      <w:r>
-        <w:rPr>
-          <w:rFonts w:ascii="Consolas" w:hAnsi="Consolas"/>
-          <w:b w:val="0"/>
-          <w:color w:val="1F4D78"/>
-          <w:sz w:val="16"/>
-        </w:rPr>
-        <w:t xml:space="preserve">  "longitude":72.878</w:t>
-      </w:r>
-    </w:p>
-    <w:p>
-      <w:pPr>
-        <w:keepLines/>
-        <w:spacing w:after="60" w:line="240" w:lineRule="auto"/>
-        <w:ind w:left="230" w:right="115"/>
-        <w:shd w:fill="F5F8FC"/>
-      </w:pPr>
-      <w:r>
-        <w:rPr>
-          <w:rFonts w:ascii="Consolas" w:hAnsi="Consolas"/>
-          <w:b w:val="0"/>
-          <w:color w:val="1F4D78"/>
-          <w:sz w:val="16"/>
-        </w:rPr>
-        <w:t>}</w:t>
-      </w:r>
-    </w:p>
-    <w:p>
-      <w:pPr>
-        <w:spacing w:before="0" w:after="40" w:line="283" w:lineRule="auto"/>
-      </w:pPr>
-      <w:r>
-        <w:rPr>
-          <w:rFonts w:ascii="Calibri" w:hAnsi="Calibri"/>
-          <w:b/>
-          <w:color w:val="2E74B5"/>
-          <w:sz w:val="18"/>
-        </w:rPr>
-        <w:t>Expected private WebSocket message</w:t>
-      </w:r>
-    </w:p>
-    <w:p>
-      <w:pPr>
-        <w:keepLines/>
-        <w:spacing w:after="0" w:line="240" w:lineRule="auto"/>
-        <w:ind w:left="230" w:right="115"/>
-        <w:shd w:fill="F5F8FC"/>
-      </w:pPr>
-      <w:r>
-        <w:rPr>
-          <w:rFonts w:ascii="Consolas" w:hAnsi="Consolas"/>
-          <w:b w:val="0"/>
-          <w:color w:val="1F4D78"/>
-          <w:sz w:val="16"/>
-        </w:rPr>
-        <w:t>{</w:t>
-      </w:r>
-    </w:p>
-    <w:p>
-      <w:pPr>
-        <w:keepLines/>
-        <w:spacing w:after="0" w:line="240" w:lineRule="auto"/>
-        <w:ind w:left="230" w:right="115"/>
-        <w:shd w:fill="F5F8FC"/>
-      </w:pPr>
-      <w:r>
-        <w:rPr>
-          <w:rFonts w:ascii="Consolas" w:hAnsi="Consolas"/>
-          <w:b w:val="0"/>
-          <w:color w:val="1F4D78"/>
-          <w:sz w:val="16"/>
-        </w:rPr>
-        <w:t xml:space="preserve">  "type":"RIDER_LOCATION_UPDATED",</w:t>
-      </w:r>
-    </w:p>
-    <w:p>
-      <w:pPr>
-        <w:keepLines/>
-        <w:spacing w:after="0" w:line="240" w:lineRule="auto"/>
-        <w:ind w:left="230" w:right="115"/>
-        <w:shd w:fill="F5F8FC"/>
-      </w:pPr>
-      <w:r>
-        <w:rPr>
-          <w:rFonts w:ascii="Consolas" w:hAnsi="Consolas"/>
-          <w:b w:val="0"/>
-          <w:color w:val="1F4D78"/>
-          <w:sz w:val="16"/>
-        </w:rPr>
-        <w:t xml:space="preserve">  "rideId":2,</w:t>
-      </w:r>
-    </w:p>
-    <w:p>
-      <w:pPr>
-        <w:keepLines/>
-        <w:spacing w:after="0" w:line="240" w:lineRule="auto"/>
-        <w:ind w:left="230" w:right="115"/>
-        <w:shd w:fill="F5F8FC"/>
-      </w:pPr>
-      <w:r>
-        <w:rPr>
-          <w:rFonts w:ascii="Consolas" w:hAnsi="Consolas"/>
-          <w:b w:val="0"/>
-          <w:color w:val="1F4D78"/>
-          <w:sz w:val="16"/>
-        </w:rPr>
-        <w:t xml:space="preserve">  "riderId":3,</w:t>
-      </w:r>
-    </w:p>
-    <w:p>
-      <w:pPr>
-        <w:keepLines/>
-        <w:spacing w:after="0" w:line="240" w:lineRule="auto"/>
-        <w:ind w:left="230" w:right="115"/>
-        <w:shd w:fill="F5F8FC"/>
-      </w:pPr>
-      <w:r>
-        <w:rPr>
-          <w:rFonts w:ascii="Consolas" w:hAnsi="Consolas"/>
-          <w:b w:val="0"/>
-          <w:color w:val="1F4D78"/>
-          <w:sz w:val="16"/>
-        </w:rPr>
-        <w:t xml:space="preserve">  "latitude":19.078,</w:t>
-      </w:r>
-    </w:p>
-    <w:p>
-      <w:pPr>
-        <w:keepLines/>
-        <w:spacing w:after="0" w:line="240" w:lineRule="auto"/>
-        <w:ind w:left="230" w:right="115"/>
-        <w:shd w:fill="F5F8FC"/>
-      </w:pPr>
-      <w:r>
-        <w:rPr>
-          <w:rFonts w:ascii="Consolas" w:hAnsi="Consolas"/>
-          <w:b w:val="0"/>
-          <w:color w:val="1F4D78"/>
-          <w:sz w:val="16"/>
-        </w:rPr>
-        <w:t xml:space="preserve">  "longitude":72.878</w:t>
-      </w:r>
-    </w:p>
-    <w:p>
-      <w:pPr>
-        <w:keepLines/>
-        <w:spacing w:after="60" w:line="240" w:lineRule="auto"/>
-        <w:ind w:left="230" w:right="115"/>
-        <w:shd w:fill="F5F8FC"/>
-      </w:pPr>
-      <w:r>
-        <w:rPr>
-          <w:rFonts w:ascii="Consolas" w:hAnsi="Consolas"/>
-          <w:b w:val="0"/>
-          <w:color w:val="1F4D78"/>
-          <w:sz w:val="16"/>
-        </w:rPr>
-        <w:t>}</w:t>
-      </w:r>
-    </w:p>
-    <w:p>
-      <w:pPr>
-        <w:spacing w:before="0" w:after="140" w:line="283" w:lineRule="auto"/>
-      </w:pPr>
-      <w:r>
-        <w:rPr>
-          <w:rFonts w:ascii="Calibri" w:hAnsi="Calibri"/>
-          <w:b/>
-          <w:color w:val="9C6500"/>
-          <w:sz w:val="18"/>
-        </w:rPr>
-        <w:t xml:space="preserve">Important: </w:t>
-      </w:r>
-      <w:r>
-        <w:rPr>
-          <w:rFonts w:ascii="Calibri" w:hAnsi="Calibri"/>
-          <w:b w:val="0"/>
-          <w:color w:val="9C6500"/>
-          <w:sz w:val="18"/>
-        </w:rPr>
-        <w:t>Do not subscribe to /topic/ride/{rideId} for live GPS updates. The current live-location event is private and goes to /user/queue/ride/{rideId}/location only. A rider JWT cannot receive the booking admin's private queue.</w:t>
-      </w:r>
-    </w:p>
-    <w:p>
-      <w:pPr>
-        <w:keepNext/>
-        <w:spacing w:before="160" w:after="100"/>
-      </w:pPr>
-      <w:r>
-        <w:rPr>
-          <w:rFonts w:ascii="Calibri" w:hAnsi="Calibri"/>
-          <w:b/>
-          <w:color w:val="1F4D78"/>
-          <w:sz w:val="23"/>
-        </w:rPr>
-        <w:t>POST /rider/fetch/livelocation</w:t>
-      </w:r>
-    </w:p>
-    <w:p>
-      <w:pPr>
-        <w:spacing w:before="0" w:after="60" w:line="283" w:lineRule="auto"/>
-      </w:pPr>
-      <w:r>
-        <w:rPr>
-          <w:rFonts w:ascii="Calibri" w:hAnsi="Calibri"/>
-          <w:b/>
-          <w:color w:val="1F4D78"/>
-          <w:sz w:val="18"/>
-        </w:rPr>
-        <w:t xml:space="preserve">Authentication: </w:t>
-      </w:r>
-      <w:r>
-        <w:rPr>
-          <w:rFonts w:ascii="Calibri" w:hAnsi="Calibri"/>
-          <w:b w:val="0"/>
-          <w:sz w:val="18"/>
-        </w:rPr>
-        <w:t>Bearer {{riderJwt}} — RIDER role</w:t>
-      </w:r>
-      <w:r>
-        <w:rPr>
-          <w:rFonts w:ascii="Calibri" w:hAnsi="Calibri"/>
-          <w:b/>
-          <w:color w:val="1F4D78"/>
-          <w:sz w:val="18"/>
-        </w:rPr>
-        <w:t xml:space="preserve">   |   Request type: </w:t>
-      </w:r>
-      <w:r>
-        <w:rPr>
-          <w:rFonts w:ascii="Calibri" w:hAnsi="Calibri"/>
-          <w:b w:val="0"/>
-          <w:sz w:val="18"/>
-        </w:rPr>
-        <w:t>raw JSON</w:t>
-      </w:r>
-    </w:p>
-    <w:p>
-      <w:pPr>
-        <w:spacing w:before="0" w:after="40" w:line="283" w:lineRule="auto"/>
-      </w:pPr>
-      <w:r>
-        <w:rPr>
-          <w:rFonts w:ascii="Calibri" w:hAnsi="Calibri"/>
-          <w:b/>
-          <w:color w:val="1F4D78"/>
-          <w:sz w:val="18"/>
-        </w:rPr>
-        <w:t>Postman test</w:t>
-      </w:r>
-    </w:p>
-    <w:p>
-      <w:pPr>
-        <w:keepLines/>
-        <w:spacing w:after="0" w:line="240" w:lineRule="auto"/>
-        <w:ind w:left="230" w:right="115"/>
-        <w:shd w:fill="F5F8FC"/>
-      </w:pPr>
-      <w:r>
-        <w:rPr>
-          <w:rFonts w:ascii="Consolas" w:hAnsi="Consolas"/>
-          <w:b w:val="0"/>
-          <w:color w:val="1F4D78"/>
-          <w:sz w:val="16"/>
-        </w:rPr>
-        <w:t>POST {{baseUrl}}/rider/fetch/livelocation</w:t>
-      </w:r>
-    </w:p>
-    <w:p>
-      <w:pPr>
-        <w:keepLines/>
-        <w:spacing w:after="0" w:line="240" w:lineRule="auto"/>
-        <w:ind w:left="230" w:right="115"/>
-        <w:shd w:fill="F5F8FC"/>
-      </w:pPr>
-      <w:r>
-        <w:rPr>
-          <w:rFonts w:ascii="Consolas" w:hAnsi="Consolas"/>
-          <w:b w:val="0"/>
-          <w:color w:val="1F4D78"/>
-          <w:sz w:val="16"/>
-        </w:rPr>
-        <w:t>Authorization: Bearer {{riderJwt}}</w:t>
-      </w:r>
-    </w:p>
-    <w:p>
-      <w:pPr>
-        <w:keepLines/>
-        <w:spacing w:after="0" w:line="240" w:lineRule="auto"/>
-        <w:ind w:left="230" w:right="115"/>
-        <w:shd w:fill="F5F8FC"/>
-      </w:pPr>
-      <w:r>
-        <w:rPr>
-          <w:rFonts w:ascii="Consolas" w:hAnsi="Consolas"/>
-          <w:b w:val="0"/>
-          <w:color w:val="1F4D78"/>
-          <w:sz w:val="16"/>
-        </w:rPr>
-        <w:t>Content-Type: application/json</w:t>
-      </w:r>
-    </w:p>
-    <w:p>
-      <w:pPr>
-        <w:keepLines/>
-        <w:spacing w:after="0" w:line="240" w:lineRule="auto"/>
-        <w:ind w:left="230" w:right="115"/>
-        <w:shd w:fill="F5F8FC"/>
-      </w:pPr>
-      <w:r>
-        <w:rPr>
-          <w:rFonts w:ascii="Consolas" w:hAnsi="Consolas"/>
-          <w:b w:val="0"/>
-          <w:color w:val="1F4D78"/>
-          <w:sz w:val="16"/>
-        </w:rPr>
-        <w:t xml:space="preserve"> </w:t>
-      </w:r>
-    </w:p>
-    <w:p>
-      <w:pPr>
-        <w:keepLines/>
-        <w:spacing w:after="0" w:line="240" w:lineRule="auto"/>
-        <w:ind w:left="230" w:right="115"/>
-        <w:shd w:fill="F5F8FC"/>
-      </w:pPr>
-      <w:r>
-        <w:rPr>
-          <w:rFonts w:ascii="Consolas" w:hAnsi="Consolas"/>
-          <w:b w:val="0"/>
-          <w:color w:val="1F4D78"/>
-          <w:sz w:val="16"/>
-        </w:rPr>
-        <w:t>{</w:t>
-      </w:r>
-    </w:p>
-    <w:p>
-      <w:pPr>
-        <w:keepLines/>
-        <w:spacing w:after="0" w:line="240" w:lineRule="auto"/>
-        <w:ind w:left="230" w:right="115"/>
-        <w:shd w:fill="F5F8FC"/>
-      </w:pPr>
-      <w:r>
-        <w:rPr>
-          <w:rFonts w:ascii="Consolas" w:hAnsi="Consolas"/>
-          <w:b w:val="0"/>
-          <w:color w:val="1F4D78"/>
-          <w:sz w:val="16"/>
-        </w:rPr>
-        <w:t xml:space="preserve">  "latitude": 19.0780,</w:t>
-      </w:r>
-    </w:p>
-    <w:p>
-      <w:pPr>
-        <w:keepLines/>
-        <w:spacing w:after="0" w:line="240" w:lineRule="auto"/>
-        <w:ind w:left="230" w:right="115"/>
-        <w:shd w:fill="F5F8FC"/>
-      </w:pPr>
-      <w:r>
-        <w:rPr>
-          <w:rFonts w:ascii="Consolas" w:hAnsi="Consolas"/>
-          <w:b w:val="0"/>
-          <w:color w:val="1F4D78"/>
-          <w:sz w:val="16"/>
-        </w:rPr>
-        <w:t xml:space="preserve">  "longitude": 72.8780</w:t>
-      </w:r>
-    </w:p>
-    <w:p>
-      <w:pPr>
-        <w:keepLines/>
-        <w:spacing w:after="60" w:line="240" w:lineRule="auto"/>
-        <w:ind w:left="230" w:right="115"/>
-        <w:shd w:fill="F5F8FC"/>
-      </w:pPr>
-      <w:r>
-        <w:rPr>
-          <w:rFonts w:ascii="Consolas" w:hAnsi="Consolas"/>
-          <w:b w:val="0"/>
-          <w:color w:val="1F4D78"/>
-          <w:sz w:val="16"/>
-        </w:rPr>
-        <w:t>}</w:t>
-      </w:r>
-    </w:p>
-    <w:p>
-      <w:pPr>
-        <w:spacing w:before="0" w:after="100" w:line="283" w:lineRule="auto"/>
-      </w:pPr>
-      <w:r>
-        <w:rPr>
-          <w:rFonts w:ascii="Calibri" w:hAnsi="Calibri"/>
-          <w:b/>
-          <w:color w:val="1F4D78"/>
-          <w:sz w:val="18"/>
-        </w:rPr>
-        <w:t xml:space="preserve">Expected result: </w:t>
-      </w:r>
-      <w:r>
-        <w:rPr>
-          <w:rFonts w:ascii="Calibri" w:hAnsi="Calibri"/>
-          <w:b w:val="0"/>
-          <w:sz w:val="18"/>
-        </w:rPr>
-        <w:t>200 OK with RIDER_LOCATION_UPDATED including server-derived riderId and rideId.</w:t>
-      </w:r>
-    </w:p>
-    <w:p>
-      <w:pPr>
-        <w:spacing w:before="0" w:after="120" w:line="283" w:lineRule="auto"/>
-      </w:pPr>
-      <w:r>
-        <w:rPr>
-          <w:rFonts w:ascii="Calibri" w:hAnsi="Calibri"/>
-          <w:b/>
-          <w:color w:val="9C6500"/>
-          <w:sz w:val="18"/>
-        </w:rPr>
-        <w:t xml:space="preserve">Note: </w:t>
-      </w:r>
-      <w:r>
-        <w:rPr>
-          <w:rFonts w:ascii="Calibri" w:hAnsi="Calibri"/>
-          <w:b w:val="0"/>
-          <w:color w:val="9C6500"/>
-          <w:sz w:val="18"/>
-        </w:rPr>
-        <w:t>The server uses JWT username → USERS record → RIDER_DETAILS.USER_ID → active ACCEPTED/STARTED ride. If no active ride exists it returns 403 No active ride is assigned to this rider.</w:t>
-      </w:r>
-    </w:p>
-    <w:p>
-      <w:pPr>
-        <w:keepNext/>
-        <w:spacing w:before="320" w:after="140"/>
-      </w:pPr>
-      <w:r>
-        <w:rPr>
-          <w:rFonts w:ascii="Calibri" w:hAnsi="Calibri"/>
-          <w:b/>
-          <w:color w:val="2E74B5"/>
-          <w:sz w:val="32"/>
-        </w:rPr>
-        <w:t>8. Ride completion, cancellation, and utility tests</w:t>
-      </w:r>
-    </w:p>
-    <w:p>
-      <w:pPr>
-        <w:keepNext/>
-        <w:spacing w:before="160" w:after="100"/>
-      </w:pPr>
-      <w:r>
-        <w:rPr>
-          <w:rFonts w:ascii="Calibri" w:hAnsi="Calibri"/>
-          <w:b/>
-          <w:color w:val="1F4D78"/>
-          <w:sz w:val="23"/>
-        </w:rPr>
-        <w:t>POST /ride/verify-otp</w:t>
-      </w:r>
-    </w:p>
-    <w:p>
-      <w:pPr>
-        <w:spacing w:before="0" w:after="60" w:line="283" w:lineRule="auto"/>
-      </w:pPr>
-      <w:r>
-        <w:rPr>
-          <w:rFonts w:ascii="Calibri" w:hAnsi="Calibri"/>
-          <w:b/>
-          <w:color w:val="1F4D78"/>
-          <w:sz w:val="18"/>
-        </w:rPr>
-        <w:t xml:space="preserve">Authentication: </w:t>
-      </w:r>
-      <w:r>
-        <w:rPr>
-          <w:rFonts w:ascii="Calibri" w:hAnsi="Calibri"/>
-          <w:b w:val="0"/>
-          <w:sz w:val="18"/>
-        </w:rPr>
-        <w:t>Bearer {{riderJwt}} — RIDER role</w:t>
-      </w:r>
-      <w:r>
-        <w:rPr>
-          <w:rFonts w:ascii="Calibri" w:hAnsi="Calibri"/>
-          <w:b/>
-          <w:color w:val="1F4D78"/>
-          <w:sz w:val="18"/>
-        </w:rPr>
-        <w:t xml:space="preserve">   |   Request type: </w:t>
-      </w:r>
-      <w:r>
-        <w:rPr>
-          <w:rFonts w:ascii="Calibri" w:hAnsi="Calibri"/>
-          <w:b w:val="0"/>
-          <w:sz w:val="18"/>
-        </w:rPr>
-        <w:t>Query parameters</w:t>
-      </w:r>
-    </w:p>
-    <w:p>
-      <w:pPr>
-        <w:spacing w:before="0" w:after="40" w:line="283" w:lineRule="auto"/>
-      </w:pPr>
-      <w:r>
-        <w:rPr>
-          <w:rFonts w:ascii="Calibri" w:hAnsi="Calibri"/>
-          <w:b/>
-          <w:color w:val="1F4D78"/>
-          <w:sz w:val="18"/>
-        </w:rPr>
-        <w:t>Postman test</w:t>
-      </w:r>
-    </w:p>
-    <w:p>
-      <w:pPr>
-        <w:keepLines/>
-        <w:spacing w:after="0" w:line="240" w:lineRule="auto"/>
-        <w:ind w:left="230" w:right="115"/>
-        <w:shd w:fill="F5F8FC"/>
-      </w:pPr>
-      <w:r>
-        <w:rPr>
-          <w:rFonts w:ascii="Consolas" w:hAnsi="Consolas"/>
-          <w:b w:val="0"/>
-          <w:color w:val="1F4D78"/>
-          <w:sz w:val="16"/>
-        </w:rPr>
-        <w:t>POST {{baseUrl}}/ride/verify-otp?rideId={{rideId}}&amp;riderId={{riderId}}&amp;otp={{rideOtp}}</w:t>
-      </w:r>
-    </w:p>
-    <w:p>
-      <w:pPr>
-        <w:keepLines/>
-        <w:spacing w:after="60" w:line="240" w:lineRule="auto"/>
-        <w:ind w:left="230" w:right="115"/>
-        <w:shd w:fill="F5F8FC"/>
-      </w:pPr>
-      <w:r>
-        <w:rPr>
-          <w:rFonts w:ascii="Consolas" w:hAnsi="Consolas"/>
-          <w:b w:val="0"/>
-          <w:color w:val="1F4D78"/>
-          <w:sz w:val="16"/>
-        </w:rPr>
-        <w:t>Authorization: Bearer {{riderJwt}}</w:t>
-      </w:r>
-    </w:p>
-    <w:p>
-      <w:pPr>
-        <w:spacing w:before="0" w:after="100" w:line="283" w:lineRule="auto"/>
-      </w:pPr>
-      <w:r>
-        <w:rPr>
-          <w:rFonts w:ascii="Calibri" w:hAnsi="Calibri"/>
-          <w:b/>
-          <w:color w:val="1F4D78"/>
-          <w:sz w:val="18"/>
-        </w:rPr>
-        <w:t xml:space="preserve">Expected result: </w:t>
-      </w:r>
-      <w:r>
-        <w:rPr>
-          <w:rFonts w:ascii="Calibri" w:hAnsi="Calibri"/>
-          <w:b w:val="0"/>
-          <w:sz w:val="18"/>
-        </w:rPr>
-        <w:t>200 OK: OTP Verified. Ride Started</w:t>
-      </w:r>
-    </w:p>
-    <w:p>
-      <w:pPr>
-        <w:spacing w:before="0" w:after="120" w:line="283" w:lineRule="auto"/>
-      </w:pPr>
-      <w:r>
-        <w:rPr>
-          <w:rFonts w:ascii="Calibri" w:hAnsi="Calibri"/>
-          <w:b/>
-          <w:color w:val="9C6500"/>
-          <w:sz w:val="18"/>
-        </w:rPr>
-        <w:t xml:space="preserve">Note: </w:t>
-      </w:r>
-      <w:r>
-        <w:rPr>
-          <w:rFonts w:ascii="Calibri" w:hAnsi="Calibri"/>
-          <w:b w:val="0"/>
-          <w:color w:val="9C6500"/>
-          <w:sz w:val="18"/>
-        </w:rPr>
-        <w:t>The ride-start OTP has no clock expiry. It is accepted only for the assigned rider while status is ACCEPTED. On success the ride becomes STARTED and the rider becomes ON_TRIP.</w:t>
+        <w:t>The ride-start OTP has no clock expiry. It is accepted only for the assigned rider while status is ACCEPTED. On success the ride becomes STARTED; the rider was already made ON_TRIP when the ride was accepted.</w:t>
       </w:r>
     </w:p>
     <w:p>
@@ -15842,7 +16494,7 @@
                 <w:b w:val="0"/>
                 <w:sz w:val="16"/>
               </w:rPr>
-              <w:t>RIDE_DETAILS.ACCEPTED; winning rider ID assigned</w:t>
+              <w:t>RIDE_DETAILS.ACCEPTED; winning rider ID assigned; rider ON_TRIP</w:t>
             </w:r>
           </w:p>
         </w:tc>
@@ -15922,7 +16574,7 @@
                 <w:b w:val="0"/>
                 <w:sz w:val="16"/>
               </w:rPr>
-              <w:t>RIDE_DETAILS.STARTED; rider status ON_TRIP</w:t>
+              <w:t>RIDE_DETAILS.STARTED; rider remains ON_TRIP</w:t>
             </w:r>
           </w:p>
         </w:tc>
@@ -19148,7 +19800,7 @@
           <w:b w:val="0"/>
           <w:sz w:val="21"/>
         </w:rPr>
-        <w:t>Add ownership checks to /ride/accept, /ride/verify-otp, /ride/end, and cancellation endpoints so a rider token cannot submit another rider's ID.</w:t>
+        <w:t>Ownership checks are implemented for /ride/accept. Add the same authenticated-rider ownership checks to /ride/verify-otp, /ride/end, and cancellation endpoints so a rider token cannot submit another rider's ID.</w:t>
       </w:r>
     </w:p>
     <w:p>
@@ -19529,7 +20181,7 @@
                 <w:b w:val="0"/>
                 <w:sz w:val="16"/>
               </w:rPr>
-              <w:t>A rider can accept, start with the correct OTP, and end only their assigned ride.</w:t>
+              <w:t>A rider can accept only their own SENT request while AVAILABLE, then start with the correct OTP and end their assigned ride.</w:t>
             </w:r>
           </w:p>
         </w:tc>
@@ -19615,7 +20267,7 @@
         <w:color w:val="666666"/>
         <w:sz w:val="17"/>
       </w:rPr>
-      <w:t>Internal engineering reference - updated 7 August 2026</w:t>
+      <w:t>Internal engineering reference - updated 8 August 2026</w:t>
     </w:r>
   </w:p>
 </w:ftr>

</xml_diff>

<commit_message>
Implement Razorpay ride payments and deferred rider transfers
</commit_message>
<xml_diff>
--- a/docs/RIDER_BOOKING_API_AND_DATABASE_REFERENCE_UPDATED.docx
+++ b/docs/RIDER_BOOKING_API_AND_DATABASE_REFERENCE_UPDATED.docx
@@ -2590,7 +2590,7 @@
                 <w:b w:val="0"/>
                 <w:sz w:val="16"/>
               </w:rPr>
-              <w:t>GET</w:t>
+              <w:t>POST</w:t>
             </w:r>
           </w:p>
         </w:tc>
@@ -2668,7 +2668,7 @@
                 <w:b w:val="0"/>
                 <w:sz w:val="16"/>
               </w:rPr>
-              <w:t>token query</w:t>
+              <w:t>email and otp JSON</w:t>
             </w:r>
           </w:p>
         </w:tc>
@@ -5936,6 +5936,112 @@
                 <w:b w:val="0"/>
                 <w:sz w:val="15"/>
               </w:rPr>
+              <w:t>PUT</w:t>
+            </w:r>
+          </w:p>
+        </w:tc>
+        <w:tc>
+          <w:tcPr>
+            <w:tcW w:type="dxa" w:w="3629"/>
+            <w:vAlign w:val="center"/>
+            <w:tcMar>
+              <w:top w:w="72" w:type="dxa"/>
+              <w:start w:w="120" w:type="dxa"/>
+              <w:bottom w:w="72" w:type="dxa"/>
+              <w:end w:w="120" w:type="dxa"/>
+            </w:tcMar>
+          </w:tcPr>
+          <w:p>
+            <w:pPr>
+              <w:spacing w:after="0" w:line="259" w:lineRule="auto"/>
+            </w:pPr>
+            <w:r/>
+            <w:r>
+              <w:rPr>
+                <w:rFonts w:ascii="Calibri" w:hAnsi="Calibri"/>
+                <w:b w:val="0"/>
+                <w:sz w:val="15"/>
+              </w:rPr>
+              <w:t>/ride/paymentCompleted?rideId=&amp;paymentCompleted=</w:t>
+            </w:r>
+          </w:p>
+        </w:tc>
+        <w:tc>
+          <w:tcPr>
+            <w:tcW w:type="dxa" w:w="1555"/>
+            <w:vAlign w:val="center"/>
+            <w:tcMar>
+              <w:top w:w="72" w:type="dxa"/>
+              <w:start w:w="120" w:type="dxa"/>
+              <w:bottom w:w="72" w:type="dxa"/>
+              <w:end w:w="120" w:type="dxa"/>
+            </w:tcMar>
+          </w:tcPr>
+          <w:p>
+            <w:pPr>
+              <w:spacing w:after="0" w:line="259" w:lineRule="auto"/>
+            </w:pPr>
+            <w:r/>
+            <w:r>
+              <w:rPr>
+                <w:rFonts w:ascii="Calibri" w:hAnsi="Calibri"/>
+                <w:b w:val="0"/>
+                <w:sz w:val="15"/>
+              </w:rPr>
+              <w:t>JWT</w:t>
+            </w:r>
+          </w:p>
+        </w:tc>
+        <w:tc>
+          <w:tcPr>
+            <w:tcW w:type="dxa" w:w="2981"/>
+            <w:vAlign w:val="center"/>
+            <w:tcMar>
+              <w:top w:w="72" w:type="dxa"/>
+              <w:start w:w="120" w:type="dxa"/>
+              <w:bottom w:w="72" w:type="dxa"/>
+              <w:end w:w="120" w:type="dxa"/>
+            </w:tcMar>
+          </w:tcPr>
+          <w:p>
+            <w:pPr>
+              <w:spacing w:after="0" w:line="259" w:lineRule="auto"/>
+            </w:pPr>
+            <w:r/>
+            <w:r>
+              <w:rPr>
+                <w:rFonts w:ascii="Calibri" w:hAnsi="Calibri"/>
+                <w:b w:val="0"/>
+                <w:sz w:val="15"/>
+              </w:rPr>
+              <w:t>Payment JSON body</w:t>
+            </w:r>
+          </w:p>
+        </w:tc>
+      </w:tr>
+      <w:tr>
+        <w:tc>
+          <w:tcPr>
+            <w:tcW w:type="dxa" w:w="893"/>
+            <w:vAlign w:val="center"/>
+            <w:tcMar>
+              <w:top w:w="72" w:type="dxa"/>
+              <w:start w:w="120" w:type="dxa"/>
+              <w:bottom w:w="72" w:type="dxa"/>
+              <w:end w:w="120" w:type="dxa"/>
+            </w:tcMar>
+          </w:tcPr>
+          <w:p>
+            <w:pPr>
+              <w:spacing w:after="0" w:line="259" w:lineRule="auto"/>
+            </w:pPr>
+            <w:r/>
+            <w:r>
+              <w:rPr>
+                <w:rFonts w:ascii="Calibri" w:hAnsi="Calibri"/>
+                <w:b w:val="0"/>
+                <w:sz w:val="15"/>
+              </w:rPr>
               <w:t>POST</w:t>
             </w:r>
           </w:p>
@@ -8093,7 +8199,7 @@
           <w:color w:val="1F4D78"/>
           <w:sz w:val="23"/>
         </w:rPr>
-        <w:t>GET /register/confirmToken</w:t>
+        <w:t>POST /register/confirmToken</w:t>
       </w:r>
     </w:p>
     <w:p>
@@ -8132,7 +8238,7 @@
           <w:b w:val="0"/>
           <w:sz w:val="18"/>
         </w:rPr>
-        <w:t>Query parameter</w:t>
+        <w:t>raw JSON</w:t>
       </w:r>
     </w:p>
     <w:p>
@@ -8147,6 +8253,108 @@
           <w:sz w:val="18"/>
         </w:rPr>
         <w:t>Postman test</w:t>
+      </w:r>
+    </w:p>
+    <w:p>
+      <w:pPr>
+        <w:keepLines/>
+        <w:spacing w:after="0" w:line="240" w:lineRule="auto"/>
+        <w:ind w:left="230" w:right="115"/>
+        <w:shd w:fill="F5F8FC"/>
+      </w:pPr>
+      <w:r>
+        <w:rPr>
+          <w:rFonts w:ascii="Consolas" w:hAnsi="Consolas"/>
+          <w:b w:val="0"/>
+          <w:color w:val="1F4D78"/>
+          <w:sz w:val="16"/>
+        </w:rPr>
+        <w:t>POST {{baseUrl}}/register/confirmToken</w:t>
+      </w:r>
+    </w:p>
+    <w:p>
+      <w:pPr>
+        <w:keepLines/>
+        <w:spacing w:after="0" w:line="240" w:lineRule="auto"/>
+        <w:ind w:left="230" w:right="115"/>
+        <w:shd w:fill="F5F8FC"/>
+      </w:pPr>
+      <w:r>
+        <w:rPr>
+          <w:rFonts w:ascii="Consolas" w:hAnsi="Consolas"/>
+          <w:b w:val="0"/>
+          <w:color w:val="1F4D78"/>
+          <w:sz w:val="16"/>
+        </w:rPr>
+        <w:t>Content-Type: application/json</w:t>
+      </w:r>
+    </w:p>
+    <w:p>
+      <w:pPr>
+        <w:keepLines/>
+        <w:spacing w:after="0" w:line="240" w:lineRule="auto"/>
+        <w:ind w:left="230" w:right="115"/>
+        <w:shd w:fill="F5F8FC"/>
+      </w:pPr>
+      <w:r>
+        <w:rPr>
+          <w:rFonts w:ascii="Consolas" w:hAnsi="Consolas"/>
+          <w:b w:val="0"/>
+          <w:color w:val="1F4D78"/>
+          <w:sz w:val="16"/>
+        </w:rPr>
+        <w:t xml:space="preserve"> </w:t>
+      </w:r>
+    </w:p>
+    <w:p>
+      <w:pPr>
+        <w:keepLines/>
+        <w:spacing w:after="0" w:line="240" w:lineRule="auto"/>
+        <w:ind w:left="230" w:right="115"/>
+        <w:shd w:fill="F5F8FC"/>
+      </w:pPr>
+      <w:r>
+        <w:rPr>
+          <w:rFonts w:ascii="Consolas" w:hAnsi="Consolas"/>
+          <w:b w:val="0"/>
+          <w:color w:val="1F4D78"/>
+          <w:sz w:val="16"/>
+        </w:rPr>
+        <w:t>{</w:t>
+      </w:r>
+    </w:p>
+    <w:p>
+      <w:pPr>
+        <w:keepLines/>
+        <w:spacing w:after="0" w:line="240" w:lineRule="auto"/>
+        <w:ind w:left="230" w:right="115"/>
+        <w:shd w:fill="F5F8FC"/>
+      </w:pPr>
+      <w:r>
+        <w:rPr>
+          <w:rFonts w:ascii="Consolas" w:hAnsi="Consolas"/>
+          <w:b w:val="0"/>
+          <w:color w:val="1F4D78"/>
+          <w:sz w:val="16"/>
+        </w:rPr>
+        <w:t xml:space="preserve">  "email": "admin@example.com",</w:t>
+      </w:r>
+    </w:p>
+    <w:p>
+      <w:pPr>
+        <w:keepLines/>
+        <w:spacing w:after="0" w:line="240" w:lineRule="auto"/>
+        <w:ind w:left="230" w:right="115"/>
+        <w:shd w:fill="F5F8FC"/>
+      </w:pPr>
+      <w:r>
+        <w:rPr>
+          <w:rFonts w:ascii="Consolas" w:hAnsi="Consolas"/>
+          <w:b w:val="0"/>
+          <w:color w:val="1F4D78"/>
+          <w:sz w:val="16"/>
+        </w:rPr>
+        <w:t xml:space="preserve">  "otp": "{{verificationOtp}}"</w:t>
       </w:r>
     </w:p>
     <w:p>
@@ -8163,7 +8371,7 @@
           <w:color w:val="1F4D78"/>
           <w:sz w:val="16"/>
         </w:rPr>
-        <w:t>GET {{baseUrl}}/register/confirmToken?token={{verificationToken}}</w:t>
+        <w:t>}</w:t>
       </w:r>
     </w:p>
     <w:p>
@@ -8185,7 +8393,7 @@
           <w:b w:val="0"/>
           <w:sz w:val="18"/>
         </w:rPr>
-        <w:t>200 OK on a valid token</w:t>
+        <w:t>200 OK on a valid OTP</w:t>
       </w:r>
     </w:p>
     <w:p>
@@ -8213,7 +8421,7 @@
           <w:b w:val="0"/>
           <w:sz w:val="18"/>
         </w:rPr>
-        <w:t xml:space="preserve">  "message": "OTP verified Successfully",</w:t>
+        <w:t xml:space="preserve">  "message": "OTP verified successfully",</w:t>
       </w:r>
     </w:p>
     <w:p>
@@ -8278,7 +8486,7 @@
           <w:color w:val="9C6500"/>
           <w:sz w:val="18"/>
         </w:rPr>
-        <w:t>Confirmation enables the account and returns its USERS.ID as userId. The returned token subject is USERS.USER_NAME. Store userId only for UI/display; protected APIs derive ownership from the JWT.</w:t>
+        <w:t>Confirmation enables the account and returns its USERS.ID as userId. The returned token subject is USERS.USER_NAME. Send the OTP in the JSON body, never in a URL query parameter: URLs may be stored in browser history, proxy logs, and analytics. Store userId only for UI/display; protected APIs derive ownership from the JWT.</w:t>
       </w:r>
     </w:p>
     <w:p>
@@ -15813,6 +16021,272 @@
           <w:sz w:val="18"/>
         </w:rPr>
         <w:t>Only a STARTED assigned ride can end. The transaction sets the ride to COMPLETED, makes the rider AVAILABLE, and creates one INVOICES row with status PENDING and amount equal to fare.</w:t>
+      </w:r>
+    </w:p>
+    <w:p>
+      <w:pPr>
+        <w:keepNext/>
+        <w:spacing w:before="160" w:after="100"/>
+      </w:pPr>
+      <w:r>
+        <w:rPr>
+          <w:rFonts w:ascii="Calibri" w:hAnsi="Calibri"/>
+          <w:b/>
+          <w:color w:val="1F4D78"/>
+          <w:sz w:val="23"/>
+        </w:rPr>
+        <w:t>PUT /ride/paymentCompleted</w:t>
+      </w:r>
+    </w:p>
+    <w:p>
+      <w:pPr>
+        <w:spacing w:before="0" w:after="60" w:line="283" w:lineRule="auto"/>
+      </w:pPr>
+      <w:r>
+        <w:rPr>
+          <w:rFonts w:ascii="Calibri" w:hAnsi="Calibri"/>
+          <w:b/>
+          <w:color w:val="1F4D78"/>
+          <w:sz w:val="18"/>
+        </w:rPr>
+        <w:t xml:space="preserve">Authentication: </w:t>
+      </w:r>
+      <w:r>
+        <w:rPr>
+          <w:rFonts w:ascii="Calibri" w:hAnsi="Calibri"/>
+          <w:b w:val="0"/>
+          <w:sz w:val="18"/>
+        </w:rPr>
+        <w:t>Bearer JWT — any authenticated user</w:t>
+      </w:r>
+      <w:r>
+        <w:rPr>
+          <w:rFonts w:ascii="Calibri" w:hAnsi="Calibri"/>
+          <w:b/>
+          <w:color w:val="1F4D78"/>
+          <w:sz w:val="18"/>
+        </w:rPr>
+        <w:t xml:space="preserve">   |   Request type: </w:t>
+      </w:r>
+      <w:r>
+        <w:rPr>
+          <w:rFonts w:ascii="Calibri" w:hAnsi="Calibri"/>
+          <w:b w:val="0"/>
+          <w:sz w:val="18"/>
+        </w:rPr>
+        <w:t>rideId and paymentCompleted query parameters; raw JSON body</w:t>
+      </w:r>
+    </w:p>
+    <w:p>
+      <w:pPr>
+        <w:spacing w:before="0" w:after="40" w:line="283" w:lineRule="auto"/>
+      </w:pPr>
+      <w:r>
+        <w:rPr>
+          <w:rFonts w:ascii="Calibri" w:hAnsi="Calibri"/>
+          <w:b/>
+          <w:color w:val="1F4D78"/>
+          <w:sz w:val="18"/>
+        </w:rPr>
+        <w:t>Postman test</w:t>
+      </w:r>
+    </w:p>
+    <w:p>
+      <w:pPr>
+        <w:keepLines/>
+        <w:spacing w:after="0" w:line="240" w:lineRule="auto"/>
+        <w:ind w:left="230" w:right="115"/>
+        <w:shd w:fill="F5F8FC"/>
+      </w:pPr>
+      <w:r>
+        <w:rPr>
+          <w:rFonts w:ascii="Consolas" w:hAnsi="Consolas"/>
+          <w:b w:val="0"/>
+          <w:color w:val="1F4D78"/>
+          <w:sz w:val="16"/>
+        </w:rPr>
+        <w:t>PUT {{baseUrl}}/ride/paymentCompleted?rideId={{rideId}}&amp;paymentCompleted=COMPLETED</w:t>
+      </w:r>
+    </w:p>
+    <w:p>
+      <w:pPr>
+        <w:keepLines/>
+        <w:spacing w:after="0" w:line="240" w:lineRule="auto"/>
+        <w:ind w:left="230" w:right="115"/>
+        <w:shd w:fill="F5F8FC"/>
+      </w:pPr>
+      <w:r>
+        <w:rPr>
+          <w:rFonts w:ascii="Consolas" w:hAnsi="Consolas"/>
+          <w:b w:val="0"/>
+          <w:color w:val="1F4D78"/>
+          <w:sz w:val="16"/>
+        </w:rPr>
+        <w:t>Authorization: Bearer {{adminJwt}}</w:t>
+      </w:r>
+    </w:p>
+    <w:p>
+      <w:pPr>
+        <w:keepLines/>
+        <w:spacing w:after="0" w:line="240" w:lineRule="auto"/>
+        <w:ind w:left="230" w:right="115"/>
+        <w:shd w:fill="F5F8FC"/>
+      </w:pPr>
+      <w:r>
+        <w:rPr>
+          <w:rFonts w:ascii="Consolas" w:hAnsi="Consolas"/>
+          <w:b w:val="0"/>
+          <w:color w:val="1F4D78"/>
+          <w:sz w:val="16"/>
+        </w:rPr>
+        <w:t>Content-Type: application/json</w:t>
+      </w:r>
+    </w:p>
+    <w:p>
+      <w:pPr>
+        <w:keepLines/>
+        <w:spacing w:after="0" w:line="240" w:lineRule="auto"/>
+        <w:ind w:left="230" w:right="115"/>
+        <w:shd w:fill="F5F8FC"/>
+      </w:pPr>
+      <w:r>
+        <w:rPr>
+          <w:rFonts w:ascii="Consolas" w:hAnsi="Consolas"/>
+          <w:b w:val="0"/>
+          <w:color w:val="1F4D78"/>
+          <w:sz w:val="16"/>
+        </w:rPr>
+        <w:t xml:space="preserve"> </w:t>
+      </w:r>
+    </w:p>
+    <w:p>
+      <w:pPr>
+        <w:keepLines/>
+        <w:spacing w:after="0" w:line="240" w:lineRule="auto"/>
+        <w:ind w:left="230" w:right="115"/>
+        <w:shd w:fill="F5F8FC"/>
+      </w:pPr>
+      <w:r>
+        <w:rPr>
+          <w:rFonts w:ascii="Consolas" w:hAnsi="Consolas"/>
+          <w:b w:val="0"/>
+          <w:color w:val="1F4D78"/>
+          <w:sz w:val="16"/>
+        </w:rPr>
+        <w:t>{</w:t>
+      </w:r>
+    </w:p>
+    <w:p>
+      <w:pPr>
+        <w:keepLines/>
+        <w:spacing w:after="0" w:line="240" w:lineRule="auto"/>
+        <w:ind w:left="230" w:right="115"/>
+        <w:shd w:fill="F5F8FC"/>
+      </w:pPr>
+      <w:r>
+        <w:rPr>
+          <w:rFonts w:ascii="Consolas" w:hAnsi="Consolas"/>
+          <w:b w:val="0"/>
+          <w:color w:val="1F4D78"/>
+          <w:sz w:val="16"/>
+        </w:rPr>
+        <w:t xml:space="preserve">  "provider": "example-provider",</w:t>
+      </w:r>
+    </w:p>
+    <w:p>
+      <w:pPr>
+        <w:keepLines/>
+        <w:spacing w:after="0" w:line="240" w:lineRule="auto"/>
+        <w:ind w:left="230" w:right="115"/>
+        <w:shd w:fill="F5F8FC"/>
+      </w:pPr>
+      <w:r>
+        <w:rPr>
+          <w:rFonts w:ascii="Consolas" w:hAnsi="Consolas"/>
+          <w:b w:val="0"/>
+          <w:color w:val="1F4D78"/>
+          <w:sz w:val="16"/>
+        </w:rPr>
+        <w:t xml:space="preserve">  "paymentId": "pay_123456",</w:t>
+      </w:r>
+    </w:p>
+    <w:p>
+      <w:pPr>
+        <w:keepLines/>
+        <w:spacing w:after="0" w:line="240" w:lineRule="auto"/>
+        <w:ind w:left="230" w:right="115"/>
+        <w:shd w:fill="F5F8FC"/>
+      </w:pPr>
+      <w:r>
+        <w:rPr>
+          <w:rFonts w:ascii="Consolas" w:hAnsi="Consolas"/>
+          <w:b w:val="0"/>
+          <w:color w:val="1F4D78"/>
+          <w:sz w:val="16"/>
+        </w:rPr>
+        <w:t xml:space="preserve">  "amount": 250.00</w:t>
+      </w:r>
+    </w:p>
+    <w:p>
+      <w:pPr>
+        <w:keepLines/>
+        <w:spacing w:after="60" w:line="240" w:lineRule="auto"/>
+        <w:ind w:left="230" w:right="115"/>
+        <w:shd w:fill="F5F8FC"/>
+      </w:pPr>
+      <w:r>
+        <w:rPr>
+          <w:rFonts w:ascii="Consolas" w:hAnsi="Consolas"/>
+          <w:b w:val="0"/>
+          <w:color w:val="1F4D78"/>
+          <w:sz w:val="16"/>
+        </w:rPr>
+        <w:t>}</w:t>
+      </w:r>
+    </w:p>
+    <w:p>
+      <w:pPr>
+        <w:spacing w:before="0" w:after="100" w:line="283" w:lineRule="auto"/>
+      </w:pPr>
+      <w:r>
+        <w:rPr>
+          <w:rFonts w:ascii="Calibri" w:hAnsi="Calibri"/>
+          <w:b/>
+          <w:color w:val="1F4D78"/>
+          <w:sz w:val="18"/>
+        </w:rPr>
+        <w:t xml:space="preserve">Expected result: </w:t>
+      </w:r>
+      <w:r>
+        <w:rPr>
+          <w:rFonts w:ascii="Calibri" w:hAnsi="Calibri"/>
+          <w:b w:val="0"/>
+          <w:sz w:val="18"/>
+        </w:rPr>
+        <w:t>200 OK: Payment completed for rideId: {{rideId}}</w:t>
+      </w:r>
+    </w:p>
+    <w:p>
+      <w:pPr>
+        <w:spacing w:before="0" w:after="120" w:line="283" w:lineRule="auto"/>
+      </w:pPr>
+      <w:r>
+        <w:rPr>
+          <w:rFonts w:ascii="Calibri" w:hAnsi="Calibri"/>
+          <w:b/>
+          <w:color w:val="9C6500"/>
+          <w:sz w:val="18"/>
+        </w:rPr>
+        <w:t xml:space="preserve">Note: </w:t>
+      </w:r>
+      <w:r>
+        <w:rPr>
+          <w:rFonts w:ascii="Calibri" w:hAnsi="Calibri"/>
+          <w:b w:val="0"/>
+          <w:color w:val="9C6500"/>
+          <w:sz w:val="18"/>
+        </w:rPr>
+        <w:t>Stores paymentCompleted in RIDE_DETAILS.PAYMENT_COMPLETED and the request body in RIDE_DETAILS.PAYMENT_JSON, then publishes PAYMENT_COMPLETED to /topic/ride/{rideId}. The current implementation requires a valid JWT through SecurityConfig but has no endpoint role or ownership check, does not validate the payment status/body, and can update any existing ride. Restrict this endpoint before accepting real payment-provider callbacks.</w:t>
       </w:r>
     </w:p>
     <w:p>
@@ -16681,6 +17155,86 @@
                 <w:sz w:val="16"/>
               </w:rPr>
               <w:t>/topic/ride/{rideId} and /topic/user/{adminId}: RIDE_COMPLETED</w:t>
+            </w:r>
+          </w:p>
+        </w:tc>
+      </w:tr>
+      <w:tr>
+        <w:tc>
+          <w:tcPr>
+            <w:tcW w:type="dxa" w:w="1584"/>
+            <w:vAlign w:val="center"/>
+            <w:tcMar>
+              <w:top w:w="72" w:type="dxa"/>
+              <w:start w:w="120" w:type="dxa"/>
+              <w:bottom w:w="72" w:type="dxa"/>
+              <w:end w:w="120" w:type="dxa"/>
+            </w:tcMar>
+          </w:tcPr>
+          <w:p>
+            <w:pPr>
+              <w:spacing w:after="0" w:line="259" w:lineRule="auto"/>
+            </w:pPr>
+            <w:r/>
+            <w:r>
+              <w:rPr>
+                <w:rFonts w:ascii="Calibri" w:hAnsi="Calibri"/>
+                <w:b w:val="0"/>
+                <w:sz w:val="16"/>
+              </w:rPr>
+              <w:t>paymentCompleted</w:t>
+            </w:r>
+          </w:p>
+        </w:tc>
+        <w:tc>
+          <w:tcPr>
+            <w:tcW w:type="dxa" w:w="4392"/>
+            <w:vAlign w:val="center"/>
+            <w:tcMar>
+              <w:top w:w="72" w:type="dxa"/>
+              <w:start w:w="120" w:type="dxa"/>
+              <w:bottom w:w="72" w:type="dxa"/>
+              <w:end w:w="120" w:type="dxa"/>
+            </w:tcMar>
+          </w:tcPr>
+          <w:p>
+            <w:pPr>
+              <w:spacing w:after="0" w:line="259" w:lineRule="auto"/>
+            </w:pPr>
+            <w:r/>
+            <w:r>
+              <w:rPr>
+                <w:rFonts w:ascii="Calibri" w:hAnsi="Calibri"/>
+                <w:b w:val="0"/>
+                <w:sz w:val="16"/>
+              </w:rPr>
+              <w:t>RIDE_DETAILS.PAYMENT_COMPLETED and PAYMENT_JSON updated</w:t>
+            </w:r>
+          </w:p>
+        </w:tc>
+        <w:tc>
+          <w:tcPr>
+            <w:tcW w:type="dxa" w:w="3024"/>
+            <w:vAlign w:val="center"/>
+            <w:tcMar>
+              <w:top w:w="72" w:type="dxa"/>
+              <w:start w:w="120" w:type="dxa"/>
+              <w:bottom w:w="72" w:type="dxa"/>
+              <w:end w:w="120" w:type="dxa"/>
+            </w:tcMar>
+          </w:tcPr>
+          <w:p>
+            <w:pPr>
+              <w:spacing w:after="0" w:line="259" w:lineRule="auto"/>
+            </w:pPr>
+            <w:r/>
+            <w:r>
+              <w:rPr>
+                <w:rFonts w:ascii="Calibri" w:hAnsi="Calibri"/>
+                <w:b w:val="0"/>
+                <w:sz w:val="16"/>
+              </w:rPr>
+              <w:t>/topic/ride/{rideId}: PAYMENT_COMPLETED</w:t>
             </w:r>
           </w:p>
         </w:tc>
@@ -18066,7 +18620,7 @@
                 <w:b w:val="0"/>
                 <w:sz w:val="16"/>
               </w:rPr>
-              <w:t>Booking and lifecycle</w:t>
+              <w:t>Booking, lifecycle, and payment receipt</w:t>
             </w:r>
           </w:p>
         </w:tc>
@@ -18092,7 +18646,7 @@
                 <w:b w:val="0"/>
                 <w:sz w:val="16"/>
               </w:rPr>
-              <w:t>RIDE_ID PK; vehicle name, chassis no., rider/admin IDs, OTP, status.</w:t>
+              <w:t>RIDE_ID PK; vehicle name, chassis no., rider/admin IDs, OTP, status, PAYMENT_COMPLETED, and PAYMENT_JSON (jsonb).</w:t>
             </w:r>
           </w:p>
         </w:tc>
@@ -18848,7 +19402,7 @@
           <w:color w:val="9C6500"/>
           <w:sz w:val="18"/>
         </w:rPr>
-        <w:t>Render is configured with Flyway disabled in production. Apply V7, V8, and V9 manually to the Render-connected Neon branch before deploying code that references USERS.ROLE, RIDER_DETAILS.USER_ID, CHASSIS_NO, or VEHICLE_NAME.</w:t>
+        <w:t>Render is configured with Flyway disabled in production. Apply V7, V8, and V9 manually to the Render-connected Neon branch before deploying code that references USERS.ROLE, RIDER_DETAILS.USER_ID, CHASSIS_NO, or VEHICLE_NAME. The payment endpoint additionally requires RIDE_DETAILS.PAYMENT_COMPLETED (text) and RIDE_DETAILS.PAYMENT_JSON (jsonb); there is currently no migration file for those columns.</w:t>
       </w:r>
     </w:p>
     <w:p>

</xml_diff>